<commit_message>
Completed 2nd Internal Assignment Questions
</commit_message>
<xml_diff>
--- a/Internal/1st Internal/Python 1st Internal Question Paper.docx
+++ b/Internal/1st Internal/Python 1st Internal Question Paper.docx
@@ -158,6 +158,7 @@
                 <w:szCs w:val="24"/>
               </w:rPr>
             </w:pPr>
+            <w:proofErr w:type="spellStart"/>
             <w:r>
               <w:rPr>
                 <w:rFonts w:ascii="Times New Roman" w:eastAsia="Times New Roman" w:hAnsi="Times New Roman" w:cs="Times New Roman"/>
@@ -165,7 +166,17 @@
                 <w:sz w:val="24"/>
                 <w:szCs w:val="24"/>
               </w:rPr>
-              <w:t>Kenjar, Mangalore-574142</w:t>
+              <w:t>Kenjar</w:t>
+            </w:r>
+            <w:proofErr w:type="spellEnd"/>
+            <w:r>
+              <w:rPr>
+                <w:rFonts w:ascii="Times New Roman" w:eastAsia="Times New Roman" w:hAnsi="Times New Roman" w:cs="Times New Roman"/>
+                <w:b/>
+                <w:sz w:val="24"/>
+                <w:szCs w:val="24"/>
+              </w:rPr>
+              <w:t>, Mangalore-574142</w:t>
             </w:r>
           </w:p>
           <w:p>
@@ -2745,6 +2756,3235 @@
           <w:highlight w:val="yellow"/>
         </w:rPr>
       </w:pPr>
+      <w:r>
+        <w:rPr>
+          <w:rFonts w:ascii="Times New Roman" w:eastAsia="Times New Roman" w:hAnsi="Times New Roman" w:cs="Times New Roman"/>
+          <w:b/>
+          <w:sz w:val="24"/>
+          <w:szCs w:val="24"/>
+        </w:rPr>
+        <w:t>Subject Faculty</w:t>
+      </w:r>
+      <w:r>
+        <w:rPr>
+          <w:rFonts w:ascii="Times New Roman" w:eastAsia="Times New Roman" w:hAnsi="Times New Roman" w:cs="Times New Roman"/>
+          <w:b/>
+          <w:sz w:val="24"/>
+          <w:szCs w:val="24"/>
+        </w:rPr>
+        <w:tab/>
+      </w:r>
+      <w:r>
+        <w:rPr>
+          <w:rFonts w:ascii="Times New Roman" w:eastAsia="Times New Roman" w:hAnsi="Times New Roman" w:cs="Times New Roman"/>
+          <w:b/>
+          <w:sz w:val="24"/>
+          <w:szCs w:val="24"/>
+        </w:rPr>
+        <w:tab/>
+        <w:t xml:space="preserve">     IA Coordinator</w:t>
+      </w:r>
+      <w:r>
+        <w:rPr>
+          <w:rFonts w:ascii="Times New Roman" w:eastAsia="Times New Roman" w:hAnsi="Times New Roman" w:cs="Times New Roman"/>
+          <w:b/>
+          <w:sz w:val="24"/>
+          <w:szCs w:val="24"/>
+        </w:rPr>
+        <w:tab/>
+      </w:r>
+      <w:r>
+        <w:rPr>
+          <w:rFonts w:ascii="Times New Roman" w:eastAsia="Times New Roman" w:hAnsi="Times New Roman" w:cs="Times New Roman"/>
+          <w:b/>
+          <w:sz w:val="24"/>
+          <w:szCs w:val="24"/>
+        </w:rPr>
+        <w:tab/>
+        <w:t xml:space="preserve">            Head of the Department</w:t>
+      </w:r>
+    </w:p>
+    <w:p>
+      <w:pPr>
+        <w:rPr>
+          <w:rFonts w:ascii="Times New Roman" w:eastAsia="Times New Roman" w:hAnsi="Times New Roman" w:cs="Times New Roman"/>
+          <w:sz w:val="24"/>
+          <w:szCs w:val="24"/>
+          <w:highlight w:val="yellow"/>
+        </w:rPr>
+      </w:pPr>
+    </w:p>
+    <w:p>
+      <w:pPr>
+        <w:rPr>
+          <w:rFonts w:ascii="Times New Roman" w:hAnsi="Times New Roman" w:cs="Times New Roman"/>
+          <w:b/>
+          <w:bCs/>
+        </w:rPr>
+      </w:pPr>
+      <w:r>
+        <w:rPr>
+          <w:rFonts w:ascii="Times New Roman" w:hAnsi="Times New Roman" w:cs="Times New Roman"/>
+          <w:b/>
+          <w:bCs/>
+        </w:rPr>
+        <w:lastRenderedPageBreak/>
+        <w:t>SCHEME OF EVALUATION:</w:t>
+      </w:r>
+    </w:p>
+    <w:tbl>
+      <w:tblPr>
+        <w:tblStyle w:val="TableGrid0"/>
+        <w:tblW w:w="10840" w:type="dxa"/>
+        <w:tblInd w:w="-780" w:type="dxa"/>
+        <w:tblCellMar>
+          <w:top w:w="4" w:type="dxa"/>
+          <w:left w:w="107" w:type="dxa"/>
+          <w:right w:w="35" w:type="dxa"/>
+        </w:tblCellMar>
+        <w:tblLook w:val="04A0" w:firstRow="1" w:lastRow="0" w:firstColumn="1" w:lastColumn="0" w:noHBand="0" w:noVBand="1"/>
+      </w:tblPr>
+      <w:tblGrid>
+        <w:gridCol w:w="987"/>
+        <w:gridCol w:w="555"/>
+        <w:gridCol w:w="8023"/>
+        <w:gridCol w:w="1275"/>
+      </w:tblGrid>
+      <w:tr>
+        <w:trPr>
+          <w:trHeight w:val="838"/>
+        </w:trPr>
+        <w:tc>
+          <w:tcPr>
+            <w:tcW w:w="10840" w:type="dxa"/>
+            <w:gridSpan w:val="4"/>
+            <w:tcBorders>
+              <w:top w:val="single" w:sz="4" w:space="0" w:color="000000"/>
+              <w:left w:val="single" w:sz="4" w:space="0" w:color="000000"/>
+              <w:bottom w:val="single" w:sz="4" w:space="0" w:color="000000"/>
+              <w:right w:val="single" w:sz="4" w:space="0" w:color="000000"/>
+            </w:tcBorders>
+          </w:tcPr>
+          <w:p>
+            <w:pPr>
+              <w:ind w:right="15"/>
+              <w:rPr>
+                <w:rFonts w:ascii="Times New Roman" w:hAnsi="Times New Roman" w:cs="Times New Roman"/>
+              </w:rPr>
+            </w:pPr>
+            <w:r>
+              <w:rPr>
+                <w:rFonts w:ascii="Times New Roman" w:hAnsi="Times New Roman" w:cs="Times New Roman"/>
+              </w:rPr>
+              <w:t xml:space="preserve">SEM: </w:t>
+            </w:r>
+            <w:r>
+              <w:rPr>
+                <w:rFonts w:ascii="Times New Roman" w:hAnsi="Times New Roman" w:cs="Times New Roman"/>
+              </w:rPr>
+              <w:t>1st</w:t>
+            </w:r>
+            <w:r>
+              <w:rPr>
+                <w:rFonts w:ascii="Times New Roman" w:hAnsi="Times New Roman" w:cs="Times New Roman"/>
+              </w:rPr>
+              <w:t xml:space="preserve"> </w:t>
+            </w:r>
+            <w:r>
+              <w:rPr>
+                <w:rFonts w:ascii="Times New Roman" w:hAnsi="Times New Roman" w:cs="Times New Roman"/>
+              </w:rPr>
+              <w:t>SEM, 1</w:t>
+            </w:r>
+            <w:r>
+              <w:rPr>
+                <w:rFonts w:ascii="Times New Roman" w:hAnsi="Times New Roman" w:cs="Times New Roman"/>
+                <w:vertAlign w:val="superscript"/>
+              </w:rPr>
+              <w:t>st</w:t>
+            </w:r>
+            <w:r>
+              <w:rPr>
+                <w:rFonts w:ascii="Times New Roman" w:hAnsi="Times New Roman" w:cs="Times New Roman"/>
+              </w:rPr>
+              <w:t xml:space="preserve"> Internal                                                                                                                            Max. Marks: 30</w:t>
+            </w:r>
+          </w:p>
+          <w:p>
+            <w:pPr>
+              <w:ind w:left="8"/>
+              <w:rPr>
+                <w:rFonts w:ascii="Times New Roman" w:hAnsi="Times New Roman" w:cs="Times New Roman"/>
+              </w:rPr>
+            </w:pPr>
+            <w:r>
+              <w:rPr>
+                <w:rFonts w:ascii="Times New Roman" w:hAnsi="Times New Roman" w:cs="Times New Roman"/>
+              </w:rPr>
+              <w:t xml:space="preserve">COURSE NAME: </w:t>
+            </w:r>
+            <w:r>
+              <w:rPr>
+                <w:rFonts w:ascii="Times New Roman" w:eastAsia="Times New Roman" w:hAnsi="Times New Roman" w:cs="Times New Roman"/>
+                <w:b/>
+                <w:sz w:val="24"/>
+                <w:szCs w:val="24"/>
+              </w:rPr>
+              <w:t xml:space="preserve">ML &amp; </w:t>
+            </w:r>
+            <w:r>
+              <w:rPr>
+                <w:rFonts w:ascii="Times New Roman" w:eastAsia="Times New Roman" w:hAnsi="Times New Roman" w:cs="Times New Roman"/>
+                <w:b/>
+                <w:sz w:val="24"/>
+                <w:szCs w:val="24"/>
+              </w:rPr>
+              <w:t>Data Analytics using Python</w:t>
+            </w:r>
+            <w:r>
+              <w:rPr>
+                <w:rFonts w:ascii="Times New Roman" w:hAnsi="Times New Roman" w:cs="Times New Roman"/>
+              </w:rPr>
+              <w:t xml:space="preserve"> </w:t>
+            </w:r>
+          </w:p>
+          <w:p>
+            <w:pPr>
+              <w:ind w:left="8"/>
+              <w:rPr>
+                <w:rFonts w:ascii="Times New Roman" w:hAnsi="Times New Roman" w:cs="Times New Roman"/>
+              </w:rPr>
+            </w:pPr>
+            <w:r>
+              <w:rPr>
+                <w:rFonts w:ascii="Times New Roman" w:hAnsi="Times New Roman" w:cs="Times New Roman"/>
+              </w:rPr>
+              <w:t xml:space="preserve">COURSE CODE: </w:t>
+            </w:r>
+            <w:r>
+              <w:rPr>
+                <w:rFonts w:ascii="Times New Roman" w:eastAsia="Times New Roman" w:hAnsi="Times New Roman" w:cs="Times New Roman"/>
+                <w:b/>
+                <w:sz w:val="24"/>
+                <w:szCs w:val="24"/>
+              </w:rPr>
+              <w:t>MMC201</w:t>
+            </w:r>
+            <w:r>
+              <w:rPr>
+                <w:rFonts w:ascii="Times New Roman" w:hAnsi="Times New Roman" w:cs="Times New Roman"/>
+              </w:rPr>
+              <w:t xml:space="preserve"> </w:t>
+            </w:r>
+            <w:r>
+              <w:rPr>
+                <w:rFonts w:ascii="Times New Roman" w:hAnsi="Times New Roman" w:cs="Times New Roman"/>
+              </w:rPr>
+              <w:t xml:space="preserve">                                                                                                                    Date: </w:t>
+            </w:r>
+            <w:r>
+              <w:rPr>
+                <w:rFonts w:ascii="Times New Roman" w:eastAsia="Times New Roman" w:hAnsi="Times New Roman" w:cs="Times New Roman"/>
+                <w:b/>
+                <w:sz w:val="24"/>
+                <w:szCs w:val="24"/>
+              </w:rPr>
+              <w:t>09</w:t>
+            </w:r>
+            <w:r>
+              <w:rPr>
+                <w:rFonts w:ascii="Times New Roman" w:eastAsia="Times New Roman" w:hAnsi="Times New Roman" w:cs="Times New Roman"/>
+                <w:b/>
+                <w:sz w:val="24"/>
+                <w:szCs w:val="24"/>
+              </w:rPr>
+              <w:t>/0</w:t>
+            </w:r>
+            <w:r>
+              <w:rPr>
+                <w:rFonts w:ascii="Times New Roman" w:eastAsia="Times New Roman" w:hAnsi="Times New Roman" w:cs="Times New Roman"/>
+                <w:b/>
+                <w:sz w:val="24"/>
+                <w:szCs w:val="24"/>
+              </w:rPr>
+              <w:t>6</w:t>
+            </w:r>
+            <w:r>
+              <w:rPr>
+                <w:rFonts w:ascii="Times New Roman" w:eastAsia="Times New Roman" w:hAnsi="Times New Roman" w:cs="Times New Roman"/>
+                <w:b/>
+                <w:sz w:val="24"/>
+                <w:szCs w:val="24"/>
+              </w:rPr>
+              <w:t>/202</w:t>
+            </w:r>
+            <w:r>
+              <w:rPr>
+                <w:rFonts w:ascii="Times New Roman" w:eastAsia="Times New Roman" w:hAnsi="Times New Roman" w:cs="Times New Roman"/>
+                <w:b/>
+                <w:sz w:val="24"/>
+                <w:szCs w:val="24"/>
+              </w:rPr>
+              <w:t>5</w:t>
+            </w:r>
+          </w:p>
+        </w:tc>
+      </w:tr>
+      <w:tr>
+        <w:trPr>
+          <w:trHeight w:val="593"/>
+        </w:trPr>
+        <w:tc>
+          <w:tcPr>
+            <w:tcW w:w="977" w:type="dxa"/>
+            <w:tcBorders>
+              <w:top w:val="single" w:sz="4" w:space="0" w:color="000000"/>
+              <w:left w:val="single" w:sz="4" w:space="0" w:color="000000"/>
+              <w:bottom w:val="single" w:sz="4" w:space="0" w:color="000000"/>
+              <w:right w:val="single" w:sz="4" w:space="0" w:color="000000"/>
+            </w:tcBorders>
+          </w:tcPr>
+          <w:p>
+            <w:pPr>
+              <w:spacing w:line="238" w:lineRule="auto"/>
+              <w:ind w:left="8" w:right="42"/>
+              <w:rPr>
+                <w:rFonts w:ascii="Times New Roman" w:hAnsi="Times New Roman" w:cs="Times New Roman"/>
+              </w:rPr>
+            </w:pPr>
+            <w:r>
+              <w:rPr>
+                <w:rFonts w:ascii="Times New Roman" w:hAnsi="Times New Roman" w:cs="Times New Roman"/>
+              </w:rPr>
+              <w:t xml:space="preserve">Question </w:t>
+            </w:r>
+          </w:p>
+          <w:p>
+            <w:pPr>
+              <w:ind w:left="8"/>
+              <w:rPr>
+                <w:rFonts w:ascii="Times New Roman" w:hAnsi="Times New Roman" w:cs="Times New Roman"/>
+              </w:rPr>
+            </w:pPr>
+            <w:r>
+              <w:rPr>
+                <w:rFonts w:ascii="Times New Roman" w:hAnsi="Times New Roman" w:cs="Times New Roman"/>
+              </w:rPr>
+              <w:t xml:space="preserve">Number  </w:t>
+            </w:r>
+          </w:p>
+        </w:tc>
+        <w:tc>
+          <w:tcPr>
+            <w:tcW w:w="555" w:type="dxa"/>
+            <w:tcBorders>
+              <w:top w:val="single" w:sz="4" w:space="0" w:color="000000"/>
+              <w:left w:val="single" w:sz="4" w:space="0" w:color="000000"/>
+              <w:bottom w:val="single" w:sz="4" w:space="0" w:color="000000"/>
+              <w:right w:val="single" w:sz="4" w:space="0" w:color="000000"/>
+            </w:tcBorders>
+          </w:tcPr>
+          <w:p>
+            <w:pPr>
+              <w:ind w:left="14"/>
+              <w:rPr>
+                <w:rFonts w:ascii="Times New Roman" w:hAnsi="Times New Roman" w:cs="Times New Roman"/>
+              </w:rPr>
+            </w:pPr>
+            <w:r>
+              <w:rPr>
+                <w:rFonts w:ascii="Times New Roman" w:hAnsi="Times New Roman" w:cs="Times New Roman"/>
+              </w:rPr>
+              <w:t xml:space="preserve"> </w:t>
+            </w:r>
+          </w:p>
+        </w:tc>
+        <w:tc>
+          <w:tcPr>
+            <w:tcW w:w="8032" w:type="dxa"/>
+            <w:tcBorders>
+              <w:top w:val="single" w:sz="4" w:space="0" w:color="000000"/>
+              <w:left w:val="single" w:sz="4" w:space="0" w:color="000000"/>
+              <w:bottom w:val="single" w:sz="4" w:space="0" w:color="000000"/>
+              <w:right w:val="single" w:sz="4" w:space="0" w:color="000000"/>
+            </w:tcBorders>
+          </w:tcPr>
+          <w:p>
+            <w:pPr>
+              <w:ind w:right="15"/>
+              <w:jc w:val="center"/>
+              <w:rPr>
+                <w:rFonts w:ascii="Times New Roman" w:hAnsi="Times New Roman" w:cs="Times New Roman"/>
+              </w:rPr>
+            </w:pPr>
+            <w:r>
+              <w:rPr>
+                <w:rFonts w:ascii="Times New Roman" w:hAnsi="Times New Roman" w:cs="Times New Roman"/>
+              </w:rPr>
+              <w:t xml:space="preserve"> </w:t>
+            </w:r>
+          </w:p>
+          <w:p>
+            <w:pPr>
+              <w:ind w:right="81"/>
+              <w:jc w:val="center"/>
+              <w:rPr>
+                <w:rFonts w:ascii="Times New Roman" w:hAnsi="Times New Roman" w:cs="Times New Roman"/>
+              </w:rPr>
+            </w:pPr>
+            <w:r>
+              <w:rPr>
+                <w:rFonts w:ascii="Times New Roman" w:hAnsi="Times New Roman" w:cs="Times New Roman"/>
+                <w:b/>
+              </w:rPr>
+              <w:t>Note: Answer any one full question from each part</w:t>
+            </w:r>
+            <w:r>
+              <w:rPr>
+                <w:rFonts w:ascii="Times New Roman" w:hAnsi="Times New Roman" w:cs="Times New Roman"/>
+              </w:rPr>
+              <w:t xml:space="preserve"> </w:t>
+            </w:r>
+          </w:p>
+        </w:tc>
+        <w:tc>
+          <w:tcPr>
+            <w:tcW w:w="1276" w:type="dxa"/>
+            <w:tcBorders>
+              <w:top w:val="single" w:sz="4" w:space="0" w:color="000000"/>
+              <w:left w:val="single" w:sz="4" w:space="0" w:color="000000"/>
+              <w:bottom w:val="single" w:sz="4" w:space="0" w:color="000000"/>
+              <w:right w:val="single" w:sz="4" w:space="0" w:color="000000"/>
+            </w:tcBorders>
+          </w:tcPr>
+          <w:p>
+            <w:pPr>
+              <w:ind w:left="8"/>
+              <w:rPr>
+                <w:rFonts w:ascii="Times New Roman" w:hAnsi="Times New Roman" w:cs="Times New Roman"/>
+              </w:rPr>
+            </w:pPr>
+            <w:r>
+              <w:rPr>
+                <w:rFonts w:ascii="Times New Roman" w:hAnsi="Times New Roman" w:cs="Times New Roman"/>
+              </w:rPr>
+              <w:t xml:space="preserve">Marks </w:t>
+            </w:r>
+          </w:p>
+        </w:tc>
+      </w:tr>
+      <w:tr>
+        <w:trPr>
+          <w:trHeight w:val="1651"/>
+        </w:trPr>
+        <w:tc>
+          <w:tcPr>
+            <w:tcW w:w="977" w:type="dxa"/>
+            <w:tcBorders>
+              <w:top w:val="single" w:sz="4" w:space="0" w:color="000000"/>
+              <w:left w:val="single" w:sz="4" w:space="0" w:color="000000"/>
+              <w:bottom w:val="single" w:sz="4" w:space="0" w:color="000000"/>
+              <w:right w:val="single" w:sz="4" w:space="0" w:color="000000"/>
+            </w:tcBorders>
+          </w:tcPr>
+          <w:p>
+            <w:pPr>
+              <w:ind w:left="8"/>
+              <w:rPr>
+                <w:rFonts w:ascii="Times New Roman" w:hAnsi="Times New Roman" w:cs="Times New Roman"/>
+              </w:rPr>
+            </w:pPr>
+            <w:r>
+              <w:rPr>
+                <w:rFonts w:ascii="Times New Roman" w:hAnsi="Times New Roman" w:cs="Times New Roman"/>
+              </w:rPr>
+              <w:t xml:space="preserve"> </w:t>
+            </w:r>
+          </w:p>
+          <w:p>
+            <w:pPr>
+              <w:ind w:left="8"/>
+              <w:rPr>
+                <w:rFonts w:ascii="Times New Roman" w:hAnsi="Times New Roman" w:cs="Times New Roman"/>
+              </w:rPr>
+            </w:pPr>
+            <w:r>
+              <w:rPr>
+                <w:rFonts w:ascii="Times New Roman" w:hAnsi="Times New Roman" w:cs="Times New Roman"/>
+              </w:rPr>
+              <w:t>I</w:t>
+            </w:r>
+          </w:p>
+          <w:p>
+            <w:pPr>
+              <w:ind w:left="8"/>
+              <w:rPr>
+                <w:rFonts w:ascii="Times New Roman" w:hAnsi="Times New Roman" w:cs="Times New Roman"/>
+              </w:rPr>
+            </w:pPr>
+            <w:r>
+              <w:rPr>
+                <w:rFonts w:ascii="Times New Roman" w:hAnsi="Times New Roman" w:cs="Times New Roman"/>
+              </w:rPr>
+              <w:t xml:space="preserve"> </w:t>
+            </w:r>
+          </w:p>
+        </w:tc>
+        <w:tc>
+          <w:tcPr>
+            <w:tcW w:w="555" w:type="dxa"/>
+            <w:tcBorders>
+              <w:top w:val="single" w:sz="4" w:space="0" w:color="000000"/>
+              <w:left w:val="single" w:sz="4" w:space="0" w:color="000000"/>
+              <w:bottom w:val="single" w:sz="4" w:space="0" w:color="000000"/>
+              <w:right w:val="single" w:sz="4" w:space="0" w:color="000000"/>
+            </w:tcBorders>
+          </w:tcPr>
+          <w:p>
+            <w:pPr>
+              <w:ind w:left="14"/>
+              <w:rPr>
+                <w:rFonts w:ascii="Times New Roman" w:hAnsi="Times New Roman" w:cs="Times New Roman"/>
+              </w:rPr>
+            </w:pPr>
+            <w:r>
+              <w:rPr>
+                <w:rFonts w:ascii="Times New Roman" w:hAnsi="Times New Roman" w:cs="Times New Roman"/>
+              </w:rPr>
+              <w:t xml:space="preserve">1 </w:t>
+            </w:r>
+          </w:p>
+          <w:p>
+            <w:pPr>
+              <w:ind w:left="14"/>
+              <w:rPr>
+                <w:rFonts w:ascii="Times New Roman" w:hAnsi="Times New Roman" w:cs="Times New Roman"/>
+              </w:rPr>
+            </w:pPr>
+            <w:r>
+              <w:rPr>
+                <w:rFonts w:ascii="Times New Roman" w:hAnsi="Times New Roman" w:cs="Times New Roman"/>
+              </w:rPr>
+              <w:t xml:space="preserve"> </w:t>
+            </w:r>
+          </w:p>
+          <w:p>
+            <w:pPr>
+              <w:ind w:left="14"/>
+              <w:rPr>
+                <w:rFonts w:ascii="Times New Roman" w:hAnsi="Times New Roman" w:cs="Times New Roman"/>
+              </w:rPr>
+            </w:pPr>
+            <w:r>
+              <w:rPr>
+                <w:rFonts w:ascii="Times New Roman" w:hAnsi="Times New Roman" w:cs="Times New Roman"/>
+              </w:rPr>
+              <w:t xml:space="preserve"> </w:t>
+            </w:r>
+          </w:p>
+          <w:p>
+            <w:pPr>
+              <w:ind w:left="14"/>
+              <w:rPr>
+                <w:rFonts w:ascii="Times New Roman" w:hAnsi="Times New Roman" w:cs="Times New Roman"/>
+              </w:rPr>
+            </w:pPr>
+            <w:r>
+              <w:rPr>
+                <w:rFonts w:ascii="Times New Roman" w:hAnsi="Times New Roman" w:cs="Times New Roman"/>
+              </w:rPr>
+              <w:t xml:space="preserve">  </w:t>
+            </w:r>
+          </w:p>
+          <w:p>
+            <w:pPr>
+              <w:ind w:left="14"/>
+              <w:rPr>
+                <w:rFonts w:ascii="Times New Roman" w:hAnsi="Times New Roman" w:cs="Times New Roman"/>
+              </w:rPr>
+            </w:pPr>
+          </w:p>
+          <w:p>
+            <w:pPr>
+              <w:ind w:left="14"/>
+              <w:rPr>
+                <w:rFonts w:ascii="Times New Roman" w:hAnsi="Times New Roman" w:cs="Times New Roman"/>
+              </w:rPr>
+            </w:pPr>
+          </w:p>
+          <w:p>
+            <w:pPr>
+              <w:ind w:left="14"/>
+              <w:rPr>
+                <w:rFonts w:ascii="Times New Roman" w:hAnsi="Times New Roman" w:cs="Times New Roman"/>
+              </w:rPr>
+            </w:pPr>
+          </w:p>
+          <w:p>
+            <w:pPr>
+              <w:ind w:left="14"/>
+              <w:rPr>
+                <w:rFonts w:ascii="Times New Roman" w:hAnsi="Times New Roman" w:cs="Times New Roman"/>
+              </w:rPr>
+            </w:pPr>
+            <w:r>
+              <w:rPr>
+                <w:rFonts w:ascii="Times New Roman" w:hAnsi="Times New Roman" w:cs="Times New Roman"/>
+              </w:rPr>
+              <w:t>2</w:t>
+            </w:r>
+          </w:p>
+        </w:tc>
+        <w:tc>
+          <w:tcPr>
+            <w:tcW w:w="8032" w:type="dxa"/>
+            <w:tcBorders>
+              <w:top w:val="single" w:sz="4" w:space="0" w:color="000000"/>
+              <w:left w:val="single" w:sz="4" w:space="0" w:color="000000"/>
+              <w:bottom w:val="single" w:sz="4" w:space="0" w:color="000000"/>
+              <w:right w:val="single" w:sz="4" w:space="0" w:color="000000"/>
+            </w:tcBorders>
+          </w:tcPr>
+          <w:p>
+            <w:pPr>
+              <w:ind w:left="6"/>
+              <w:rPr>
+                <w:rFonts w:ascii="Times New Roman" w:hAnsi="Times New Roman" w:cs="Times New Roman"/>
+                <w:sz w:val="18"/>
+                <w:szCs w:val="18"/>
+              </w:rPr>
+            </w:pPr>
+            <w:r>
+              <w:rPr>
+                <w:rFonts w:ascii="Times New Roman" w:hAnsi="Times New Roman" w:cs="Times New Roman"/>
+                <w:b/>
+                <w:bCs/>
+                <w:sz w:val="18"/>
+                <w:szCs w:val="18"/>
+              </w:rPr>
+              <w:t>Definition of Machine Learning (</w:t>
+            </w:r>
+            <w:r>
+              <w:rPr>
+                <w:rFonts w:ascii="Times New Roman" w:hAnsi="Times New Roman" w:cs="Times New Roman"/>
+                <w:b/>
+                <w:bCs/>
+                <w:sz w:val="18"/>
+                <w:szCs w:val="18"/>
+              </w:rPr>
+              <w:t>2</w:t>
+            </w:r>
+            <w:r>
+              <w:rPr>
+                <w:rFonts w:ascii="Times New Roman" w:hAnsi="Times New Roman" w:cs="Times New Roman"/>
+                <w:b/>
+                <w:bCs/>
+                <w:sz w:val="18"/>
+                <w:szCs w:val="18"/>
+              </w:rPr>
+              <w:t xml:space="preserve"> Mark)</w:t>
+            </w:r>
+            <w:r>
+              <w:rPr>
+                <w:rFonts w:ascii="Times New Roman" w:hAnsi="Times New Roman" w:cs="Times New Roman"/>
+                <w:sz w:val="18"/>
+                <w:szCs w:val="18"/>
+              </w:rPr>
+              <w:t xml:space="preserve"> – Explanation of its purpose and definition (learning from data without explicit programming).</w:t>
+            </w:r>
+          </w:p>
+          <w:p>
+            <w:pPr>
+              <w:ind w:left="6"/>
+              <w:rPr>
+                <w:rFonts w:ascii="Times New Roman" w:hAnsi="Times New Roman" w:cs="Times New Roman"/>
+                <w:sz w:val="18"/>
+                <w:szCs w:val="18"/>
+              </w:rPr>
+            </w:pPr>
+            <w:r>
+              <w:rPr>
+                <w:rFonts w:ascii="Times New Roman" w:hAnsi="Times New Roman" w:cs="Times New Roman"/>
+                <w:b/>
+                <w:bCs/>
+                <w:sz w:val="18"/>
+                <w:szCs w:val="18"/>
+              </w:rPr>
+              <w:t>Supervised Learning (2 Marks)</w:t>
+            </w:r>
+            <w:r>
+              <w:rPr>
+                <w:rFonts w:ascii="Times New Roman" w:hAnsi="Times New Roman" w:cs="Times New Roman"/>
+                <w:sz w:val="18"/>
+                <w:szCs w:val="18"/>
+              </w:rPr>
+              <w:t xml:space="preserve"> – Definition, </w:t>
+            </w:r>
+            <w:proofErr w:type="spellStart"/>
+            <w:r>
+              <w:rPr>
+                <w:rFonts w:ascii="Times New Roman" w:hAnsi="Times New Roman" w:cs="Times New Roman"/>
+                <w:sz w:val="18"/>
+                <w:szCs w:val="18"/>
+              </w:rPr>
+              <w:t>labeled</w:t>
+            </w:r>
+            <w:proofErr w:type="spellEnd"/>
+            <w:r>
+              <w:rPr>
+                <w:rFonts w:ascii="Times New Roman" w:hAnsi="Times New Roman" w:cs="Times New Roman"/>
+                <w:sz w:val="18"/>
+                <w:szCs w:val="18"/>
+              </w:rPr>
+              <w:t xml:space="preserve"> data concept, syntax-like explanation (Input → Output), suitable example (e.g., spam detection), and simple diagram.</w:t>
+            </w:r>
+          </w:p>
+          <w:p>
+            <w:pPr>
+              <w:ind w:left="6"/>
+              <w:rPr>
+                <w:rFonts w:ascii="Times New Roman" w:hAnsi="Times New Roman" w:cs="Times New Roman"/>
+                <w:sz w:val="18"/>
+                <w:szCs w:val="18"/>
+              </w:rPr>
+            </w:pPr>
+            <w:r>
+              <w:rPr>
+                <w:rFonts w:ascii="Times New Roman" w:hAnsi="Times New Roman" w:cs="Times New Roman"/>
+                <w:b/>
+                <w:bCs/>
+                <w:sz w:val="18"/>
+                <w:szCs w:val="18"/>
+              </w:rPr>
+              <w:t>Unsupervised Learning (2 Marks)</w:t>
+            </w:r>
+            <w:r>
+              <w:rPr>
+                <w:rFonts w:ascii="Times New Roman" w:hAnsi="Times New Roman" w:cs="Times New Roman"/>
+                <w:sz w:val="18"/>
+                <w:szCs w:val="18"/>
+              </w:rPr>
+              <w:t xml:space="preserve"> – Definition, </w:t>
+            </w:r>
+            <w:proofErr w:type="spellStart"/>
+            <w:r>
+              <w:rPr>
+                <w:rFonts w:ascii="Times New Roman" w:hAnsi="Times New Roman" w:cs="Times New Roman"/>
+                <w:sz w:val="18"/>
+                <w:szCs w:val="18"/>
+              </w:rPr>
+              <w:t>unlabeled</w:t>
+            </w:r>
+            <w:proofErr w:type="spellEnd"/>
+            <w:r>
+              <w:rPr>
+                <w:rFonts w:ascii="Times New Roman" w:hAnsi="Times New Roman" w:cs="Times New Roman"/>
+                <w:sz w:val="18"/>
+                <w:szCs w:val="18"/>
+              </w:rPr>
+              <w:t xml:space="preserve"> data concept, example (e.g., clustering customers), and basic diagram (e.g., K-means clusters).</w:t>
+            </w:r>
+          </w:p>
+          <w:p>
+            <w:pPr>
+              <w:ind w:left="6"/>
+              <w:rPr>
+                <w:rFonts w:ascii="Times New Roman" w:hAnsi="Times New Roman" w:cs="Times New Roman"/>
+                <w:sz w:val="18"/>
+                <w:szCs w:val="18"/>
+              </w:rPr>
+            </w:pPr>
+            <w:r>
+              <w:rPr>
+                <w:rFonts w:ascii="Times New Roman" w:hAnsi="Times New Roman" w:cs="Times New Roman"/>
+                <w:b/>
+                <w:bCs/>
+                <w:sz w:val="18"/>
+                <w:szCs w:val="18"/>
+              </w:rPr>
+              <w:t>Reinforcement Learning (2 Marks)</w:t>
+            </w:r>
+            <w:r>
+              <w:rPr>
+                <w:rFonts w:ascii="Times New Roman" w:hAnsi="Times New Roman" w:cs="Times New Roman"/>
+                <w:sz w:val="18"/>
+                <w:szCs w:val="18"/>
+              </w:rPr>
+              <w:t xml:space="preserve"> – Definition, agent-environment interaction, example (e.g., game bot), and simple reward-feedback loop diagram.</w:t>
+            </w:r>
+          </w:p>
+          <w:p>
+            <w:pPr>
+              <w:ind w:left="6"/>
+              <w:rPr>
+                <w:rFonts w:ascii="Times New Roman" w:hAnsi="Times New Roman" w:cs="Times New Roman"/>
+                <w:sz w:val="18"/>
+                <w:szCs w:val="18"/>
+              </w:rPr>
+            </w:pPr>
+          </w:p>
+          <w:p>
+            <w:pPr>
+              <w:ind w:left="6"/>
+              <w:rPr>
+                <w:rFonts w:ascii="Times New Roman" w:hAnsi="Times New Roman" w:cs="Times New Roman"/>
+                <w:sz w:val="18"/>
+                <w:szCs w:val="18"/>
+              </w:rPr>
+            </w:pPr>
+            <w:r>
+              <w:rPr>
+                <w:rFonts w:ascii="Times New Roman" w:hAnsi="Times New Roman" w:cs="Times New Roman"/>
+                <w:b/>
+                <w:bCs/>
+                <w:sz w:val="18"/>
+                <w:szCs w:val="18"/>
+              </w:rPr>
+              <w:t>Introduction (1 Mark)</w:t>
+            </w:r>
+            <w:r>
+              <w:rPr>
+                <w:rFonts w:ascii="Times New Roman" w:hAnsi="Times New Roman" w:cs="Times New Roman"/>
+                <w:sz w:val="18"/>
+                <w:szCs w:val="18"/>
+              </w:rPr>
+              <w:t xml:space="preserve"> – General purpose of ML in real-world domains.</w:t>
+            </w:r>
+          </w:p>
+          <w:p>
+            <w:pPr>
+              <w:ind w:left="6"/>
+              <w:rPr>
+                <w:rFonts w:ascii="Times New Roman" w:hAnsi="Times New Roman" w:cs="Times New Roman"/>
+                <w:sz w:val="18"/>
+                <w:szCs w:val="18"/>
+              </w:rPr>
+            </w:pPr>
+            <w:r>
+              <w:rPr>
+                <w:rFonts w:ascii="Times New Roman" w:hAnsi="Times New Roman" w:cs="Times New Roman"/>
+                <w:b/>
+                <w:bCs/>
+                <w:sz w:val="18"/>
+                <w:szCs w:val="18"/>
+              </w:rPr>
+              <w:t>Healthcare (1.5 Marks)</w:t>
+            </w:r>
+            <w:r>
+              <w:rPr>
+                <w:rFonts w:ascii="Times New Roman" w:hAnsi="Times New Roman" w:cs="Times New Roman"/>
+                <w:sz w:val="18"/>
+                <w:szCs w:val="18"/>
+              </w:rPr>
+              <w:t xml:space="preserve"> – Explanation and example (e.g., disease prediction, image analysis).</w:t>
+            </w:r>
+          </w:p>
+          <w:p>
+            <w:pPr>
+              <w:ind w:left="6"/>
+              <w:rPr>
+                <w:rFonts w:ascii="Times New Roman" w:hAnsi="Times New Roman" w:cs="Times New Roman"/>
+                <w:sz w:val="18"/>
+                <w:szCs w:val="18"/>
+              </w:rPr>
+            </w:pPr>
+            <w:r>
+              <w:rPr>
+                <w:rFonts w:ascii="Times New Roman" w:hAnsi="Times New Roman" w:cs="Times New Roman"/>
+                <w:b/>
+                <w:bCs/>
+                <w:sz w:val="18"/>
+                <w:szCs w:val="18"/>
+              </w:rPr>
+              <w:t>Finance (1.5 Marks)</w:t>
+            </w:r>
+            <w:r>
+              <w:rPr>
+                <w:rFonts w:ascii="Times New Roman" w:hAnsi="Times New Roman" w:cs="Times New Roman"/>
+                <w:sz w:val="18"/>
+                <w:szCs w:val="18"/>
+              </w:rPr>
+              <w:t xml:space="preserve"> – Explanation and example (e.g., fraud detection, credit scoring).</w:t>
+            </w:r>
+          </w:p>
+          <w:p>
+            <w:pPr>
+              <w:ind w:left="6"/>
+              <w:rPr>
+                <w:rFonts w:ascii="Times New Roman" w:hAnsi="Times New Roman" w:cs="Times New Roman"/>
+                <w:sz w:val="18"/>
+                <w:szCs w:val="18"/>
+              </w:rPr>
+            </w:pPr>
+            <w:r>
+              <w:rPr>
+                <w:rFonts w:ascii="Times New Roman" w:hAnsi="Times New Roman" w:cs="Times New Roman"/>
+                <w:b/>
+                <w:bCs/>
+                <w:sz w:val="18"/>
+                <w:szCs w:val="18"/>
+              </w:rPr>
+              <w:t>E-commerce (1.5 Marks)</w:t>
+            </w:r>
+            <w:r>
+              <w:rPr>
+                <w:rFonts w:ascii="Times New Roman" w:hAnsi="Times New Roman" w:cs="Times New Roman"/>
+                <w:sz w:val="18"/>
+                <w:szCs w:val="18"/>
+              </w:rPr>
+              <w:t xml:space="preserve"> – Explanation and example (e.g., product recommendations).</w:t>
+            </w:r>
+          </w:p>
+          <w:p>
+            <w:pPr>
+              <w:ind w:left="6"/>
+              <w:rPr>
+                <w:rFonts w:ascii="Times New Roman" w:hAnsi="Times New Roman" w:cs="Times New Roman"/>
+                <w:sz w:val="18"/>
+                <w:szCs w:val="18"/>
+              </w:rPr>
+            </w:pPr>
+            <w:r>
+              <w:rPr>
+                <w:rFonts w:ascii="Times New Roman" w:hAnsi="Times New Roman" w:cs="Times New Roman"/>
+                <w:b/>
+                <w:bCs/>
+                <w:sz w:val="18"/>
+                <w:szCs w:val="18"/>
+              </w:rPr>
+              <w:t>Any 2 other domains (1</w:t>
+            </w:r>
+            <w:r>
+              <w:rPr>
+                <w:rFonts w:ascii="Times New Roman" w:hAnsi="Times New Roman" w:cs="Times New Roman"/>
+                <w:b/>
+                <w:bCs/>
+                <w:sz w:val="18"/>
+                <w:szCs w:val="18"/>
+              </w:rPr>
+              <w:t>.5</w:t>
+            </w:r>
+            <w:r>
+              <w:rPr>
+                <w:rFonts w:ascii="Times New Roman" w:hAnsi="Times New Roman" w:cs="Times New Roman"/>
+                <w:b/>
+                <w:bCs/>
+                <w:sz w:val="18"/>
+                <w:szCs w:val="18"/>
+              </w:rPr>
+              <w:t xml:space="preserve"> Mark each)</w:t>
+            </w:r>
+            <w:r>
+              <w:rPr>
+                <w:rFonts w:ascii="Times New Roman" w:hAnsi="Times New Roman" w:cs="Times New Roman"/>
+                <w:sz w:val="18"/>
+                <w:szCs w:val="18"/>
+              </w:rPr>
+              <w:t xml:space="preserve"> – e.g., Transportation, Agriculture, Education, Cybersecurity.</w:t>
+            </w:r>
+          </w:p>
+        </w:tc>
+        <w:tc>
+          <w:tcPr>
+            <w:tcW w:w="1276" w:type="dxa"/>
+            <w:tcBorders>
+              <w:top w:val="single" w:sz="4" w:space="0" w:color="000000"/>
+              <w:left w:val="single" w:sz="4" w:space="0" w:color="000000"/>
+              <w:bottom w:val="single" w:sz="4" w:space="0" w:color="000000"/>
+              <w:right w:val="single" w:sz="4" w:space="0" w:color="000000"/>
+            </w:tcBorders>
+          </w:tcPr>
+          <w:p>
+            <w:pPr>
+              <w:ind w:left="8"/>
+              <w:rPr>
+                <w:rFonts w:ascii="Times New Roman" w:hAnsi="Times New Roman" w:cs="Times New Roman"/>
+                <w:sz w:val="18"/>
+                <w:szCs w:val="18"/>
+              </w:rPr>
+            </w:pPr>
+            <w:r>
+              <w:rPr>
+                <w:rFonts w:ascii="Times New Roman" w:hAnsi="Times New Roman" w:cs="Times New Roman"/>
+                <w:sz w:val="18"/>
+                <w:szCs w:val="18"/>
+              </w:rPr>
+              <w:t xml:space="preserve"> </w:t>
+            </w:r>
+          </w:p>
+          <w:p>
+            <w:pPr>
+              <w:ind w:left="8"/>
+              <w:rPr>
+                <w:rFonts w:ascii="Times New Roman" w:hAnsi="Times New Roman" w:cs="Times New Roman"/>
+                <w:b/>
+                <w:bCs/>
+                <w:sz w:val="18"/>
+                <w:szCs w:val="18"/>
+              </w:rPr>
+            </w:pPr>
+            <w:r>
+              <w:rPr>
+                <w:rFonts w:ascii="Times New Roman" w:hAnsi="Times New Roman" w:cs="Times New Roman"/>
+                <w:b/>
+                <w:bCs/>
+                <w:sz w:val="18"/>
+                <w:szCs w:val="18"/>
+              </w:rPr>
+              <w:t>8M</w:t>
+            </w:r>
+          </w:p>
+          <w:p>
+            <w:pPr>
+              <w:ind w:left="8"/>
+              <w:rPr>
+                <w:rFonts w:ascii="Times New Roman" w:hAnsi="Times New Roman" w:cs="Times New Roman"/>
+                <w:sz w:val="18"/>
+                <w:szCs w:val="18"/>
+              </w:rPr>
+            </w:pPr>
+            <w:r>
+              <w:rPr>
+                <w:rFonts w:ascii="Times New Roman" w:hAnsi="Times New Roman" w:cs="Times New Roman"/>
+                <w:sz w:val="18"/>
+                <w:szCs w:val="18"/>
+              </w:rPr>
+              <w:t xml:space="preserve"> </w:t>
+            </w:r>
+          </w:p>
+          <w:p>
+            <w:pPr>
+              <w:rPr>
+                <w:rFonts w:ascii="Times New Roman" w:hAnsi="Times New Roman" w:cs="Times New Roman"/>
+                <w:sz w:val="18"/>
+                <w:szCs w:val="18"/>
+              </w:rPr>
+            </w:pPr>
+          </w:p>
+          <w:p>
+            <w:pPr>
+              <w:rPr>
+                <w:rFonts w:ascii="Times New Roman" w:hAnsi="Times New Roman" w:cs="Times New Roman"/>
+                <w:sz w:val="18"/>
+                <w:szCs w:val="18"/>
+              </w:rPr>
+            </w:pPr>
+          </w:p>
+          <w:p>
+            <w:pPr>
+              <w:rPr>
+                <w:rFonts w:ascii="Times New Roman" w:hAnsi="Times New Roman" w:cs="Times New Roman"/>
+                <w:sz w:val="18"/>
+                <w:szCs w:val="18"/>
+              </w:rPr>
+            </w:pPr>
+          </w:p>
+          <w:p>
+            <w:pPr>
+              <w:rPr>
+                <w:rFonts w:ascii="Times New Roman" w:hAnsi="Times New Roman" w:cs="Times New Roman"/>
+                <w:sz w:val="18"/>
+                <w:szCs w:val="18"/>
+              </w:rPr>
+            </w:pPr>
+          </w:p>
+          <w:p>
+            <w:pPr>
+              <w:ind w:left="8"/>
+              <w:rPr>
+                <w:rFonts w:ascii="Times New Roman" w:hAnsi="Times New Roman" w:cs="Times New Roman"/>
+                <w:sz w:val="18"/>
+                <w:szCs w:val="18"/>
+              </w:rPr>
+            </w:pPr>
+          </w:p>
+          <w:p>
+            <w:pPr>
+              <w:ind w:left="8"/>
+              <w:rPr>
+                <w:rFonts w:ascii="Times New Roman" w:hAnsi="Times New Roman" w:cs="Times New Roman"/>
+                <w:sz w:val="18"/>
+                <w:szCs w:val="18"/>
+              </w:rPr>
+            </w:pPr>
+            <w:r>
+              <w:rPr>
+                <w:rFonts w:ascii="Times New Roman" w:hAnsi="Times New Roman" w:cs="Times New Roman"/>
+                <w:sz w:val="18"/>
+                <w:szCs w:val="18"/>
+              </w:rPr>
+              <w:t>7M</w:t>
+            </w:r>
+          </w:p>
+        </w:tc>
+      </w:tr>
+      <w:tr>
+        <w:trPr>
+          <w:trHeight w:val="286"/>
+        </w:trPr>
+        <w:tc>
+          <w:tcPr>
+            <w:tcW w:w="977" w:type="dxa"/>
+            <w:tcBorders>
+              <w:top w:val="single" w:sz="4" w:space="0" w:color="000000"/>
+              <w:left w:val="single" w:sz="4" w:space="0" w:color="000000"/>
+              <w:bottom w:val="single" w:sz="4" w:space="0" w:color="000000"/>
+              <w:right w:val="single" w:sz="4" w:space="0" w:color="000000"/>
+            </w:tcBorders>
+          </w:tcPr>
+          <w:p>
+            <w:pPr>
+              <w:ind w:left="8"/>
+              <w:rPr>
+                <w:rFonts w:ascii="Times New Roman" w:hAnsi="Times New Roman" w:cs="Times New Roman"/>
+              </w:rPr>
+            </w:pPr>
+            <w:r>
+              <w:rPr>
+                <w:rFonts w:ascii="Times New Roman" w:hAnsi="Times New Roman" w:cs="Times New Roman"/>
+              </w:rPr>
+              <w:t xml:space="preserve"> </w:t>
+            </w:r>
+          </w:p>
+        </w:tc>
+        <w:tc>
+          <w:tcPr>
+            <w:tcW w:w="555" w:type="dxa"/>
+            <w:tcBorders>
+              <w:top w:val="single" w:sz="4" w:space="0" w:color="000000"/>
+              <w:left w:val="single" w:sz="4" w:space="0" w:color="000000"/>
+              <w:bottom w:val="single" w:sz="4" w:space="0" w:color="000000"/>
+              <w:right w:val="single" w:sz="4" w:space="0" w:color="000000"/>
+            </w:tcBorders>
+          </w:tcPr>
+          <w:p>
+            <w:pPr>
+              <w:ind w:left="14"/>
+              <w:rPr>
+                <w:rFonts w:ascii="Times New Roman" w:hAnsi="Times New Roman" w:cs="Times New Roman"/>
+              </w:rPr>
+            </w:pPr>
+            <w:r>
+              <w:rPr>
+                <w:rFonts w:ascii="Times New Roman" w:hAnsi="Times New Roman" w:cs="Times New Roman"/>
+              </w:rPr>
+              <w:t xml:space="preserve"> </w:t>
+            </w:r>
+          </w:p>
+        </w:tc>
+        <w:tc>
+          <w:tcPr>
+            <w:tcW w:w="8032" w:type="dxa"/>
+            <w:tcBorders>
+              <w:top w:val="single" w:sz="4" w:space="0" w:color="000000"/>
+              <w:left w:val="single" w:sz="4" w:space="0" w:color="000000"/>
+              <w:bottom w:val="single" w:sz="4" w:space="0" w:color="000000"/>
+              <w:right w:val="single" w:sz="4" w:space="0" w:color="000000"/>
+            </w:tcBorders>
+          </w:tcPr>
+          <w:p>
+            <w:pPr>
+              <w:ind w:right="78"/>
+              <w:jc w:val="center"/>
+              <w:rPr>
+                <w:rFonts w:ascii="Times New Roman" w:hAnsi="Times New Roman" w:cs="Times New Roman"/>
+                <w:sz w:val="18"/>
+                <w:szCs w:val="18"/>
+              </w:rPr>
+            </w:pPr>
+            <w:r>
+              <w:rPr>
+                <w:rFonts w:ascii="Times New Roman" w:hAnsi="Times New Roman" w:cs="Times New Roman"/>
+                <w:sz w:val="18"/>
+                <w:szCs w:val="18"/>
+              </w:rPr>
+              <w:t xml:space="preserve">OR </w:t>
+            </w:r>
+          </w:p>
+        </w:tc>
+        <w:tc>
+          <w:tcPr>
+            <w:tcW w:w="1276" w:type="dxa"/>
+            <w:tcBorders>
+              <w:top w:val="single" w:sz="4" w:space="0" w:color="000000"/>
+              <w:left w:val="single" w:sz="4" w:space="0" w:color="000000"/>
+              <w:bottom w:val="single" w:sz="4" w:space="0" w:color="000000"/>
+              <w:right w:val="single" w:sz="4" w:space="0" w:color="000000"/>
+            </w:tcBorders>
+          </w:tcPr>
+          <w:p>
+            <w:pPr>
+              <w:ind w:left="8"/>
+              <w:rPr>
+                <w:rFonts w:ascii="Times New Roman" w:hAnsi="Times New Roman" w:cs="Times New Roman"/>
+                <w:sz w:val="18"/>
+                <w:szCs w:val="18"/>
+              </w:rPr>
+            </w:pPr>
+            <w:r>
+              <w:rPr>
+                <w:rFonts w:ascii="Times New Roman" w:hAnsi="Times New Roman" w:cs="Times New Roman"/>
+                <w:sz w:val="18"/>
+                <w:szCs w:val="18"/>
+              </w:rPr>
+              <w:t xml:space="preserve"> </w:t>
+            </w:r>
+          </w:p>
+        </w:tc>
+      </w:tr>
+      <w:tr>
+        <w:trPr>
+          <w:trHeight w:val="2618"/>
+        </w:trPr>
+        <w:tc>
+          <w:tcPr>
+            <w:tcW w:w="977" w:type="dxa"/>
+            <w:tcBorders>
+              <w:top w:val="single" w:sz="4" w:space="0" w:color="000000"/>
+              <w:left w:val="single" w:sz="4" w:space="0" w:color="000000"/>
+              <w:bottom w:val="single" w:sz="4" w:space="0" w:color="000000"/>
+              <w:right w:val="single" w:sz="4" w:space="0" w:color="000000"/>
+            </w:tcBorders>
+          </w:tcPr>
+          <w:p>
+            <w:pPr>
+              <w:ind w:left="8"/>
+              <w:rPr>
+                <w:rFonts w:ascii="Times New Roman" w:hAnsi="Times New Roman" w:cs="Times New Roman"/>
+              </w:rPr>
+            </w:pPr>
+            <w:r>
+              <w:rPr>
+                <w:rFonts w:ascii="Times New Roman" w:hAnsi="Times New Roman" w:cs="Times New Roman"/>
+              </w:rPr>
+              <w:t xml:space="preserve"> </w:t>
+            </w:r>
+          </w:p>
+          <w:p>
+            <w:pPr>
+              <w:ind w:left="8"/>
+              <w:rPr>
+                <w:rFonts w:ascii="Times New Roman" w:hAnsi="Times New Roman" w:cs="Times New Roman"/>
+              </w:rPr>
+            </w:pPr>
+            <w:r>
+              <w:rPr>
+                <w:rFonts w:ascii="Times New Roman" w:hAnsi="Times New Roman" w:cs="Times New Roman"/>
+              </w:rPr>
+              <w:t>II</w:t>
+            </w:r>
+          </w:p>
+        </w:tc>
+        <w:tc>
+          <w:tcPr>
+            <w:tcW w:w="555" w:type="dxa"/>
+            <w:tcBorders>
+              <w:top w:val="single" w:sz="4" w:space="0" w:color="000000"/>
+              <w:left w:val="single" w:sz="4" w:space="0" w:color="000000"/>
+              <w:bottom w:val="single" w:sz="4" w:space="0" w:color="000000"/>
+              <w:right w:val="single" w:sz="4" w:space="0" w:color="000000"/>
+            </w:tcBorders>
+          </w:tcPr>
+          <w:p>
+            <w:pPr>
+              <w:ind w:left="14"/>
+              <w:rPr>
+                <w:rFonts w:ascii="Times New Roman" w:hAnsi="Times New Roman" w:cs="Times New Roman"/>
+              </w:rPr>
+            </w:pPr>
+            <w:r>
+              <w:rPr>
+                <w:rFonts w:ascii="Times New Roman" w:hAnsi="Times New Roman" w:cs="Times New Roman"/>
+              </w:rPr>
+              <w:t>3</w:t>
+            </w:r>
+          </w:p>
+          <w:p>
+            <w:pPr>
+              <w:ind w:left="14"/>
+              <w:rPr>
+                <w:rFonts w:ascii="Times New Roman" w:hAnsi="Times New Roman" w:cs="Times New Roman"/>
+              </w:rPr>
+            </w:pPr>
+            <w:r>
+              <w:rPr>
+                <w:rFonts w:ascii="Times New Roman" w:hAnsi="Times New Roman" w:cs="Times New Roman"/>
+              </w:rPr>
+              <w:t xml:space="preserve"> </w:t>
+            </w:r>
+          </w:p>
+          <w:p>
+            <w:pPr>
+              <w:ind w:left="14"/>
+              <w:rPr>
+                <w:rFonts w:ascii="Times New Roman" w:hAnsi="Times New Roman" w:cs="Times New Roman"/>
+              </w:rPr>
+            </w:pPr>
+            <w:r>
+              <w:rPr>
+                <w:rFonts w:ascii="Times New Roman" w:hAnsi="Times New Roman" w:cs="Times New Roman"/>
+              </w:rPr>
+              <w:t xml:space="preserve"> </w:t>
+            </w:r>
+          </w:p>
+          <w:p>
+            <w:pPr>
+              <w:rPr>
+                <w:rFonts w:ascii="Times New Roman" w:hAnsi="Times New Roman" w:cs="Times New Roman"/>
+              </w:rPr>
+            </w:pPr>
+          </w:p>
+          <w:p>
+            <w:pPr>
+              <w:rPr>
+                <w:rFonts w:ascii="Times New Roman" w:hAnsi="Times New Roman" w:cs="Times New Roman"/>
+              </w:rPr>
+            </w:pPr>
+          </w:p>
+          <w:p>
+            <w:pPr>
+              <w:rPr>
+                <w:rFonts w:ascii="Times New Roman" w:hAnsi="Times New Roman" w:cs="Times New Roman"/>
+              </w:rPr>
+            </w:pPr>
+          </w:p>
+          <w:p>
+            <w:pPr>
+              <w:ind w:left="14"/>
+              <w:rPr>
+                <w:rFonts w:ascii="Times New Roman" w:hAnsi="Times New Roman" w:cs="Times New Roman"/>
+              </w:rPr>
+            </w:pPr>
+            <w:r>
+              <w:rPr>
+                <w:rFonts w:ascii="Times New Roman" w:hAnsi="Times New Roman" w:cs="Times New Roman"/>
+              </w:rPr>
+              <w:t>4</w:t>
+            </w:r>
+          </w:p>
+          <w:p>
+            <w:pPr>
+              <w:ind w:left="14"/>
+              <w:rPr>
+                <w:rFonts w:ascii="Times New Roman" w:hAnsi="Times New Roman" w:cs="Times New Roman"/>
+              </w:rPr>
+            </w:pPr>
+            <w:r>
+              <w:rPr>
+                <w:rFonts w:ascii="Times New Roman" w:hAnsi="Times New Roman" w:cs="Times New Roman"/>
+              </w:rPr>
+              <w:t xml:space="preserve"> </w:t>
+            </w:r>
+          </w:p>
+        </w:tc>
+        <w:tc>
+          <w:tcPr>
+            <w:tcW w:w="8032" w:type="dxa"/>
+            <w:tcBorders>
+              <w:top w:val="single" w:sz="4" w:space="0" w:color="000000"/>
+              <w:left w:val="single" w:sz="4" w:space="0" w:color="000000"/>
+              <w:bottom w:val="single" w:sz="4" w:space="0" w:color="000000"/>
+              <w:right w:val="single" w:sz="4" w:space="0" w:color="000000"/>
+            </w:tcBorders>
+          </w:tcPr>
+          <w:p>
+            <w:pPr>
+              <w:ind w:left="6"/>
+              <w:rPr>
+                <w:rFonts w:ascii="Times New Roman" w:hAnsi="Times New Roman" w:cs="Times New Roman"/>
+                <w:sz w:val="18"/>
+                <w:szCs w:val="18"/>
+              </w:rPr>
+            </w:pPr>
+            <w:r>
+              <w:rPr>
+                <w:rFonts w:ascii="Times New Roman" w:hAnsi="Times New Roman" w:cs="Times New Roman"/>
+                <w:b/>
+                <w:bCs/>
+                <w:sz w:val="18"/>
+                <w:szCs w:val="18"/>
+              </w:rPr>
+              <w:t>Definition of Supervised Learning (1 Mark)</w:t>
+            </w:r>
+            <w:r>
+              <w:rPr>
+                <w:rFonts w:ascii="Times New Roman" w:hAnsi="Times New Roman" w:cs="Times New Roman"/>
+                <w:sz w:val="18"/>
+                <w:szCs w:val="18"/>
+              </w:rPr>
+              <w:t xml:space="preserve"> – Learning from </w:t>
+            </w:r>
+            <w:proofErr w:type="spellStart"/>
+            <w:r>
+              <w:rPr>
+                <w:rFonts w:ascii="Times New Roman" w:hAnsi="Times New Roman" w:cs="Times New Roman"/>
+                <w:sz w:val="18"/>
+                <w:szCs w:val="18"/>
+              </w:rPr>
+              <w:t>labeled</w:t>
+            </w:r>
+            <w:proofErr w:type="spellEnd"/>
+            <w:r>
+              <w:rPr>
+                <w:rFonts w:ascii="Times New Roman" w:hAnsi="Times New Roman" w:cs="Times New Roman"/>
+                <w:sz w:val="18"/>
+                <w:szCs w:val="18"/>
+              </w:rPr>
+              <w:t xml:space="preserve"> data.</w:t>
+            </w:r>
+          </w:p>
+          <w:p>
+            <w:pPr>
+              <w:ind w:left="6"/>
+              <w:rPr>
+                <w:rFonts w:ascii="Times New Roman" w:hAnsi="Times New Roman" w:cs="Times New Roman"/>
+                <w:sz w:val="18"/>
+                <w:szCs w:val="18"/>
+              </w:rPr>
+            </w:pPr>
+            <w:r>
+              <w:rPr>
+                <w:rFonts w:ascii="Times New Roman" w:hAnsi="Times New Roman" w:cs="Times New Roman"/>
+                <w:b/>
+                <w:bCs/>
+                <w:sz w:val="18"/>
+                <w:szCs w:val="18"/>
+              </w:rPr>
+              <w:t>Working Explanation (1 Mark)</w:t>
+            </w:r>
+            <w:r>
+              <w:rPr>
+                <w:rFonts w:ascii="Times New Roman" w:hAnsi="Times New Roman" w:cs="Times New Roman"/>
+                <w:sz w:val="18"/>
+                <w:szCs w:val="18"/>
+              </w:rPr>
+              <w:t xml:space="preserve"> – Model learns input-output mapping.</w:t>
+            </w:r>
+          </w:p>
+          <w:p>
+            <w:pPr>
+              <w:ind w:left="6"/>
+              <w:rPr>
+                <w:rFonts w:ascii="Times New Roman" w:hAnsi="Times New Roman" w:cs="Times New Roman"/>
+                <w:sz w:val="18"/>
+                <w:szCs w:val="18"/>
+              </w:rPr>
+            </w:pPr>
+            <w:r>
+              <w:rPr>
+                <w:rFonts w:ascii="Times New Roman" w:hAnsi="Times New Roman" w:cs="Times New Roman"/>
+                <w:b/>
+                <w:bCs/>
+                <w:sz w:val="18"/>
+                <w:szCs w:val="18"/>
+              </w:rPr>
+              <w:t>Algorithm 1 (2 Marks)</w:t>
+            </w:r>
+            <w:r>
+              <w:rPr>
+                <w:rFonts w:ascii="Times New Roman" w:hAnsi="Times New Roman" w:cs="Times New Roman"/>
+                <w:sz w:val="18"/>
+                <w:szCs w:val="18"/>
+              </w:rPr>
+              <w:t xml:space="preserve"> – Definition, example, and application.</w:t>
+            </w:r>
+          </w:p>
+          <w:p>
+            <w:pPr>
+              <w:ind w:left="6"/>
+              <w:rPr>
+                <w:rFonts w:ascii="Times New Roman" w:hAnsi="Times New Roman" w:cs="Times New Roman"/>
+                <w:sz w:val="18"/>
+                <w:szCs w:val="18"/>
+              </w:rPr>
+            </w:pPr>
+            <w:r>
+              <w:rPr>
+                <w:rFonts w:ascii="Times New Roman" w:hAnsi="Times New Roman" w:cs="Times New Roman"/>
+                <w:b/>
+                <w:bCs/>
+                <w:sz w:val="18"/>
+                <w:szCs w:val="18"/>
+              </w:rPr>
+              <w:t>Algorithm 2 (2 Marks)</w:t>
+            </w:r>
+            <w:r>
+              <w:rPr>
+                <w:rFonts w:ascii="Times New Roman" w:hAnsi="Times New Roman" w:cs="Times New Roman"/>
+                <w:sz w:val="18"/>
+                <w:szCs w:val="18"/>
+              </w:rPr>
+              <w:t xml:space="preserve"> – Definition, example, and application.</w:t>
+            </w:r>
+          </w:p>
+          <w:p>
+            <w:pPr>
+              <w:ind w:left="6"/>
+              <w:rPr>
+                <w:rFonts w:ascii="Times New Roman" w:hAnsi="Times New Roman" w:cs="Times New Roman"/>
+                <w:sz w:val="18"/>
+                <w:szCs w:val="18"/>
+              </w:rPr>
+            </w:pPr>
+            <w:r>
+              <w:rPr>
+                <w:rFonts w:ascii="Times New Roman" w:hAnsi="Times New Roman" w:cs="Times New Roman"/>
+                <w:b/>
+                <w:bCs/>
+                <w:sz w:val="18"/>
+                <w:szCs w:val="18"/>
+              </w:rPr>
+              <w:t>Diagram (1 Mark)</w:t>
+            </w:r>
+            <w:r>
+              <w:rPr>
+                <w:rFonts w:ascii="Times New Roman" w:hAnsi="Times New Roman" w:cs="Times New Roman"/>
+                <w:sz w:val="18"/>
+                <w:szCs w:val="18"/>
+              </w:rPr>
+              <w:t xml:space="preserve"> – For any one algorithm.</w:t>
+            </w:r>
+          </w:p>
+          <w:p>
+            <w:pPr>
+              <w:ind w:left="6"/>
+              <w:rPr>
+                <w:rFonts w:ascii="Times New Roman" w:hAnsi="Times New Roman" w:cs="Times New Roman"/>
+                <w:sz w:val="18"/>
+                <w:szCs w:val="18"/>
+              </w:rPr>
+            </w:pPr>
+            <w:r>
+              <w:rPr>
+                <w:rFonts w:ascii="Times New Roman" w:hAnsi="Times New Roman" w:cs="Times New Roman"/>
+                <w:b/>
+                <w:bCs/>
+                <w:sz w:val="18"/>
+                <w:szCs w:val="18"/>
+              </w:rPr>
+              <w:t>Presentation / Conclusion (1 Mark)</w:t>
+            </w:r>
+            <w:r>
+              <w:rPr>
+                <w:rFonts w:ascii="Times New Roman" w:hAnsi="Times New Roman" w:cs="Times New Roman"/>
+                <w:sz w:val="18"/>
+                <w:szCs w:val="18"/>
+              </w:rPr>
+              <w:t xml:space="preserve"> – Clear structure and brief summary.</w:t>
+            </w:r>
+          </w:p>
+          <w:p>
+            <w:pPr>
+              <w:ind w:left="6"/>
+              <w:rPr>
+                <w:rFonts w:ascii="Times New Roman" w:eastAsia="Calibri" w:hAnsi="Times New Roman" w:cs="Times New Roman"/>
+                <w:sz w:val="18"/>
+                <w:szCs w:val="18"/>
+              </w:rPr>
+            </w:pPr>
+          </w:p>
+          <w:p>
+            <w:pPr>
+              <w:ind w:left="6"/>
+              <w:rPr>
+                <w:rFonts w:ascii="Times New Roman" w:hAnsi="Times New Roman" w:cs="Times New Roman"/>
+                <w:sz w:val="18"/>
+                <w:szCs w:val="18"/>
+              </w:rPr>
+            </w:pPr>
+            <w:r>
+              <w:rPr>
+                <w:rFonts w:ascii="Times New Roman" w:hAnsi="Times New Roman" w:cs="Times New Roman"/>
+                <w:b/>
+                <w:bCs/>
+                <w:sz w:val="18"/>
+                <w:szCs w:val="18"/>
+              </w:rPr>
+              <w:t>Introduction (1 Mark)</w:t>
+            </w:r>
+            <w:r>
+              <w:rPr>
+                <w:rFonts w:ascii="Times New Roman" w:hAnsi="Times New Roman" w:cs="Times New Roman"/>
+                <w:sz w:val="18"/>
+                <w:szCs w:val="18"/>
+              </w:rPr>
+              <w:t xml:space="preserve"> – Purpose of Pandas and NumPy.</w:t>
+            </w:r>
+          </w:p>
+          <w:p>
+            <w:pPr>
+              <w:ind w:left="6"/>
+              <w:rPr>
+                <w:rFonts w:ascii="Times New Roman" w:hAnsi="Times New Roman" w:cs="Times New Roman"/>
+                <w:sz w:val="18"/>
+                <w:szCs w:val="18"/>
+              </w:rPr>
+            </w:pPr>
+            <w:r>
+              <w:rPr>
+                <w:rFonts w:ascii="Times New Roman" w:hAnsi="Times New Roman" w:cs="Times New Roman"/>
+                <w:b/>
+                <w:bCs/>
+                <w:sz w:val="18"/>
+                <w:szCs w:val="18"/>
+              </w:rPr>
+              <w:t>Any 4 Comparison Points (4 Marks)</w:t>
+            </w:r>
+            <w:r>
+              <w:rPr>
+                <w:rFonts w:ascii="Times New Roman" w:hAnsi="Times New Roman" w:cs="Times New Roman"/>
+                <w:sz w:val="18"/>
+                <w:szCs w:val="18"/>
+              </w:rPr>
+              <w:t xml:space="preserve"> – 1 mark each (e.g., data structure, performance, indexing, use).</w:t>
+            </w:r>
+          </w:p>
+          <w:p>
+            <w:pPr>
+              <w:ind w:left="6"/>
+              <w:rPr>
+                <w:rFonts w:ascii="Times New Roman" w:hAnsi="Times New Roman" w:cs="Times New Roman"/>
+                <w:sz w:val="18"/>
+                <w:szCs w:val="18"/>
+              </w:rPr>
+            </w:pPr>
+            <w:r>
+              <w:rPr>
+                <w:rFonts w:ascii="Times New Roman" w:hAnsi="Times New Roman" w:cs="Times New Roman"/>
+                <w:b/>
+                <w:bCs/>
+                <w:sz w:val="18"/>
+                <w:szCs w:val="18"/>
+              </w:rPr>
+              <w:t>Use Cases (1.5 Marks)</w:t>
+            </w:r>
+            <w:r>
+              <w:rPr>
+                <w:rFonts w:ascii="Times New Roman" w:hAnsi="Times New Roman" w:cs="Times New Roman"/>
+                <w:sz w:val="18"/>
+                <w:szCs w:val="18"/>
+              </w:rPr>
+              <w:t xml:space="preserve"> – One for NumPy, one for Pandas.</w:t>
+            </w:r>
+          </w:p>
+          <w:p>
+            <w:pPr>
+              <w:ind w:left="6"/>
+              <w:rPr>
+                <w:rFonts w:ascii="Times New Roman" w:hAnsi="Times New Roman" w:cs="Times New Roman"/>
+                <w:sz w:val="18"/>
+                <w:szCs w:val="18"/>
+              </w:rPr>
+            </w:pPr>
+            <w:r>
+              <w:rPr>
+                <w:rFonts w:ascii="Times New Roman" w:hAnsi="Times New Roman" w:cs="Times New Roman"/>
+                <w:b/>
+                <w:bCs/>
+                <w:sz w:val="18"/>
+                <w:szCs w:val="18"/>
+              </w:rPr>
+              <w:t>Presentation / Conclusion (0.5 Mark)</w:t>
+            </w:r>
+            <w:r>
+              <w:rPr>
+                <w:rFonts w:ascii="Times New Roman" w:hAnsi="Times New Roman" w:cs="Times New Roman"/>
+                <w:sz w:val="18"/>
+                <w:szCs w:val="18"/>
+              </w:rPr>
+              <w:t xml:space="preserve"> – Clear structure or table.</w:t>
+            </w:r>
+          </w:p>
+        </w:tc>
+        <w:tc>
+          <w:tcPr>
+            <w:tcW w:w="1276" w:type="dxa"/>
+            <w:tcBorders>
+              <w:top w:val="single" w:sz="4" w:space="0" w:color="000000"/>
+              <w:left w:val="single" w:sz="4" w:space="0" w:color="000000"/>
+              <w:bottom w:val="single" w:sz="4" w:space="0" w:color="000000"/>
+              <w:right w:val="single" w:sz="4" w:space="0" w:color="000000"/>
+            </w:tcBorders>
+          </w:tcPr>
+          <w:p>
+            <w:pPr>
+              <w:ind w:left="8"/>
+              <w:rPr>
+                <w:rFonts w:ascii="Times New Roman" w:hAnsi="Times New Roman" w:cs="Times New Roman"/>
+                <w:sz w:val="18"/>
+                <w:szCs w:val="18"/>
+              </w:rPr>
+            </w:pPr>
+            <w:r>
+              <w:rPr>
+                <w:rFonts w:ascii="Times New Roman" w:hAnsi="Times New Roman" w:cs="Times New Roman"/>
+                <w:sz w:val="18"/>
+                <w:szCs w:val="18"/>
+              </w:rPr>
+              <w:t xml:space="preserve"> </w:t>
+            </w:r>
+          </w:p>
+          <w:p>
+            <w:pPr>
+              <w:ind w:left="8"/>
+              <w:rPr>
+                <w:rFonts w:ascii="Times New Roman" w:hAnsi="Times New Roman" w:cs="Times New Roman"/>
+                <w:sz w:val="18"/>
+                <w:szCs w:val="18"/>
+              </w:rPr>
+            </w:pPr>
+            <w:r>
+              <w:rPr>
+                <w:rFonts w:ascii="Times New Roman" w:hAnsi="Times New Roman" w:cs="Times New Roman"/>
+                <w:sz w:val="18"/>
+                <w:szCs w:val="18"/>
+              </w:rPr>
+              <w:t xml:space="preserve">8M </w:t>
+            </w:r>
+          </w:p>
+          <w:p>
+            <w:pPr>
+              <w:ind w:left="8"/>
+              <w:rPr>
+                <w:rFonts w:ascii="Times New Roman" w:hAnsi="Times New Roman" w:cs="Times New Roman"/>
+                <w:sz w:val="18"/>
+                <w:szCs w:val="18"/>
+              </w:rPr>
+            </w:pPr>
+            <w:r>
+              <w:rPr>
+                <w:rFonts w:ascii="Times New Roman" w:hAnsi="Times New Roman" w:cs="Times New Roman"/>
+                <w:sz w:val="18"/>
+                <w:szCs w:val="18"/>
+              </w:rPr>
+              <w:t xml:space="preserve"> </w:t>
+            </w:r>
+          </w:p>
+          <w:p>
+            <w:pPr>
+              <w:ind w:left="8"/>
+              <w:rPr>
+                <w:rFonts w:ascii="Times New Roman" w:hAnsi="Times New Roman" w:cs="Times New Roman"/>
+                <w:sz w:val="18"/>
+                <w:szCs w:val="18"/>
+              </w:rPr>
+            </w:pPr>
+            <w:r>
+              <w:rPr>
+                <w:rFonts w:ascii="Times New Roman" w:hAnsi="Times New Roman" w:cs="Times New Roman"/>
+                <w:sz w:val="18"/>
+                <w:szCs w:val="18"/>
+              </w:rPr>
+              <w:t xml:space="preserve"> </w:t>
+            </w:r>
+          </w:p>
+          <w:p>
+            <w:pPr>
+              <w:ind w:left="8"/>
+              <w:rPr>
+                <w:rFonts w:ascii="Times New Roman" w:hAnsi="Times New Roman" w:cs="Times New Roman"/>
+                <w:sz w:val="18"/>
+                <w:szCs w:val="18"/>
+              </w:rPr>
+            </w:pPr>
+          </w:p>
+          <w:p>
+            <w:pPr>
+              <w:ind w:left="8"/>
+              <w:rPr>
+                <w:rFonts w:ascii="Times New Roman" w:hAnsi="Times New Roman" w:cs="Times New Roman"/>
+                <w:sz w:val="18"/>
+                <w:szCs w:val="18"/>
+              </w:rPr>
+            </w:pPr>
+            <w:r>
+              <w:rPr>
+                <w:rFonts w:ascii="Times New Roman" w:hAnsi="Times New Roman" w:cs="Times New Roman"/>
+                <w:sz w:val="18"/>
+                <w:szCs w:val="18"/>
+              </w:rPr>
+              <w:t>7M</w:t>
+            </w:r>
+          </w:p>
+          <w:p>
+            <w:pPr>
+              <w:ind w:left="8"/>
+              <w:rPr>
+                <w:rFonts w:ascii="Times New Roman" w:hAnsi="Times New Roman" w:cs="Times New Roman"/>
+                <w:sz w:val="18"/>
+                <w:szCs w:val="18"/>
+              </w:rPr>
+            </w:pPr>
+            <w:r>
+              <w:rPr>
+                <w:rFonts w:ascii="Times New Roman" w:hAnsi="Times New Roman" w:cs="Times New Roman"/>
+                <w:sz w:val="18"/>
+                <w:szCs w:val="18"/>
+              </w:rPr>
+              <w:t xml:space="preserve"> </w:t>
+            </w:r>
+          </w:p>
+        </w:tc>
+      </w:tr>
+      <w:tr>
+        <w:trPr>
+          <w:trHeight w:val="1630"/>
+        </w:trPr>
+        <w:tc>
+          <w:tcPr>
+            <w:tcW w:w="977" w:type="dxa"/>
+            <w:tcBorders>
+              <w:top w:val="single" w:sz="4" w:space="0" w:color="000000"/>
+              <w:left w:val="single" w:sz="4" w:space="0" w:color="000000"/>
+              <w:bottom w:val="single" w:sz="4" w:space="0" w:color="000000"/>
+              <w:right w:val="single" w:sz="4" w:space="0" w:color="000000"/>
+            </w:tcBorders>
+          </w:tcPr>
+          <w:p>
+            <w:pPr>
+              <w:ind w:left="8"/>
+              <w:rPr>
+                <w:rFonts w:ascii="Times New Roman" w:hAnsi="Times New Roman" w:cs="Times New Roman"/>
+              </w:rPr>
+            </w:pPr>
+            <w:r>
+              <w:rPr>
+                <w:rFonts w:ascii="Times New Roman" w:hAnsi="Times New Roman" w:cs="Times New Roman"/>
+              </w:rPr>
+              <w:t xml:space="preserve"> </w:t>
+            </w:r>
+          </w:p>
+          <w:p>
+            <w:pPr>
+              <w:ind w:left="8"/>
+              <w:rPr>
+                <w:rFonts w:ascii="Times New Roman" w:hAnsi="Times New Roman" w:cs="Times New Roman"/>
+              </w:rPr>
+            </w:pPr>
+            <w:r>
+              <w:rPr>
+                <w:rFonts w:ascii="Times New Roman" w:hAnsi="Times New Roman" w:cs="Times New Roman"/>
+              </w:rPr>
+              <w:t>III</w:t>
+            </w:r>
+          </w:p>
+        </w:tc>
+        <w:tc>
+          <w:tcPr>
+            <w:tcW w:w="555" w:type="dxa"/>
+            <w:tcBorders>
+              <w:top w:val="single" w:sz="4" w:space="0" w:color="000000"/>
+              <w:left w:val="single" w:sz="4" w:space="0" w:color="000000"/>
+              <w:bottom w:val="single" w:sz="4" w:space="0" w:color="000000"/>
+              <w:right w:val="single" w:sz="4" w:space="0" w:color="000000"/>
+            </w:tcBorders>
+          </w:tcPr>
+          <w:p>
+            <w:pPr>
+              <w:rPr>
+                <w:rFonts w:ascii="Times New Roman" w:hAnsi="Times New Roman" w:cs="Times New Roman"/>
+              </w:rPr>
+            </w:pPr>
+            <w:r>
+              <w:rPr>
+                <w:rFonts w:ascii="Times New Roman" w:hAnsi="Times New Roman" w:cs="Times New Roman"/>
+              </w:rPr>
+              <w:t xml:space="preserve">5 </w:t>
+            </w:r>
+          </w:p>
+          <w:p>
+            <w:pPr>
+              <w:rPr>
+                <w:rFonts w:ascii="Times New Roman" w:hAnsi="Times New Roman" w:cs="Times New Roman"/>
+              </w:rPr>
+            </w:pPr>
+            <w:r>
+              <w:rPr>
+                <w:rFonts w:ascii="Times New Roman" w:hAnsi="Times New Roman" w:cs="Times New Roman"/>
+              </w:rPr>
+              <w:t xml:space="preserve"> </w:t>
+            </w:r>
+          </w:p>
+          <w:p>
+            <w:pPr>
+              <w:rPr>
+                <w:rFonts w:ascii="Times New Roman" w:hAnsi="Times New Roman" w:cs="Times New Roman"/>
+              </w:rPr>
+            </w:pPr>
+            <w:r>
+              <w:rPr>
+                <w:rFonts w:ascii="Times New Roman" w:hAnsi="Times New Roman" w:cs="Times New Roman"/>
+              </w:rPr>
+              <w:t xml:space="preserve"> </w:t>
+            </w:r>
+          </w:p>
+          <w:p>
+            <w:pPr>
+              <w:rPr>
+                <w:rFonts w:ascii="Times New Roman" w:hAnsi="Times New Roman" w:cs="Times New Roman"/>
+              </w:rPr>
+            </w:pPr>
+          </w:p>
+          <w:p>
+            <w:pPr>
+              <w:rPr>
+                <w:rFonts w:ascii="Times New Roman" w:hAnsi="Times New Roman" w:cs="Times New Roman"/>
+              </w:rPr>
+            </w:pPr>
+            <w:r>
+              <w:rPr>
+                <w:rFonts w:ascii="Times New Roman" w:hAnsi="Times New Roman" w:cs="Times New Roman"/>
+              </w:rPr>
+              <w:t xml:space="preserve"> </w:t>
+            </w:r>
+          </w:p>
+          <w:p>
+            <w:pPr>
+              <w:rPr>
+                <w:rFonts w:ascii="Times New Roman" w:hAnsi="Times New Roman" w:cs="Times New Roman"/>
+              </w:rPr>
+            </w:pPr>
+          </w:p>
+          <w:p>
+            <w:pPr>
+              <w:rPr>
+                <w:rFonts w:ascii="Times New Roman" w:hAnsi="Times New Roman" w:cs="Times New Roman"/>
+              </w:rPr>
+            </w:pPr>
+            <w:r>
+              <w:rPr>
+                <w:rFonts w:ascii="Times New Roman" w:hAnsi="Times New Roman" w:cs="Times New Roman"/>
+              </w:rPr>
+              <w:t xml:space="preserve">6 </w:t>
+            </w:r>
+          </w:p>
+        </w:tc>
+        <w:tc>
+          <w:tcPr>
+            <w:tcW w:w="8032" w:type="dxa"/>
+            <w:tcBorders>
+              <w:top w:val="single" w:sz="4" w:space="0" w:color="000000"/>
+              <w:left w:val="single" w:sz="4" w:space="0" w:color="000000"/>
+              <w:bottom w:val="single" w:sz="4" w:space="0" w:color="000000"/>
+              <w:right w:val="single" w:sz="4" w:space="0" w:color="000000"/>
+            </w:tcBorders>
+          </w:tcPr>
+          <w:p>
+            <w:pPr>
+              <w:ind w:left="6"/>
+              <w:rPr>
+                <w:rFonts w:ascii="Times New Roman" w:hAnsi="Times New Roman" w:cs="Times New Roman"/>
+                <w:sz w:val="18"/>
+                <w:szCs w:val="18"/>
+              </w:rPr>
+            </w:pPr>
+            <w:r>
+              <w:rPr>
+                <w:rFonts w:ascii="Times New Roman" w:hAnsi="Times New Roman" w:cs="Times New Roman"/>
+                <w:b/>
+                <w:bCs/>
+                <w:sz w:val="18"/>
+                <w:szCs w:val="18"/>
+              </w:rPr>
+              <w:t>Introduction to Pandas (1 Mark)</w:t>
+            </w:r>
+            <w:r>
+              <w:rPr>
+                <w:rFonts w:ascii="Times New Roman" w:hAnsi="Times New Roman" w:cs="Times New Roman"/>
+                <w:sz w:val="18"/>
+                <w:szCs w:val="18"/>
+              </w:rPr>
+              <w:t xml:space="preserve"> – Purpose of Pandas in data manipulation.</w:t>
+            </w:r>
+          </w:p>
+          <w:p>
+            <w:pPr>
+              <w:ind w:left="6"/>
+              <w:rPr>
+                <w:rFonts w:ascii="Times New Roman" w:hAnsi="Times New Roman" w:cs="Times New Roman"/>
+                <w:sz w:val="18"/>
+                <w:szCs w:val="18"/>
+              </w:rPr>
+            </w:pPr>
+            <w:r>
+              <w:rPr>
+                <w:rFonts w:ascii="Times New Roman" w:hAnsi="Times New Roman" w:cs="Times New Roman"/>
+                <w:b/>
+                <w:bCs/>
+                <w:sz w:val="18"/>
+                <w:szCs w:val="18"/>
+              </w:rPr>
+              <w:t>Operation 1: Selecting/Filtering Data (2 Marks)</w:t>
+            </w:r>
+            <w:r>
+              <w:rPr>
+                <w:rFonts w:ascii="Times New Roman" w:hAnsi="Times New Roman" w:cs="Times New Roman"/>
+                <w:b/>
+                <w:bCs/>
+                <w:sz w:val="18"/>
+                <w:szCs w:val="18"/>
+              </w:rPr>
+              <w:t xml:space="preserve"> </w:t>
+            </w:r>
+            <w:r>
+              <w:rPr>
+                <w:rFonts w:ascii="Times New Roman" w:hAnsi="Times New Roman" w:cs="Times New Roman"/>
+                <w:sz w:val="18"/>
+                <w:szCs w:val="18"/>
+              </w:rPr>
+              <w:t>– Use of  conditional filtering with example.</w:t>
+            </w:r>
+          </w:p>
+          <w:p>
+            <w:pPr>
+              <w:ind w:left="6"/>
+              <w:rPr>
+                <w:rFonts w:ascii="Times New Roman" w:hAnsi="Times New Roman" w:cs="Times New Roman"/>
+                <w:sz w:val="18"/>
+                <w:szCs w:val="18"/>
+              </w:rPr>
+            </w:pPr>
+            <w:r>
+              <w:rPr>
+                <w:rFonts w:ascii="Times New Roman" w:hAnsi="Times New Roman" w:cs="Times New Roman"/>
+                <w:b/>
+                <w:bCs/>
+                <w:sz w:val="18"/>
+                <w:szCs w:val="18"/>
+              </w:rPr>
+              <w:t>Operation 2: Adding/Modifying Columns (2 Marks)</w:t>
+            </w:r>
+            <w:r>
+              <w:rPr>
+                <w:rFonts w:ascii="Times New Roman" w:hAnsi="Times New Roman" w:cs="Times New Roman"/>
+                <w:b/>
+                <w:bCs/>
+                <w:sz w:val="18"/>
+                <w:szCs w:val="18"/>
+              </w:rPr>
+              <w:t xml:space="preserve"> </w:t>
+            </w:r>
+            <w:r>
+              <w:rPr>
+                <w:rFonts w:ascii="Times New Roman" w:hAnsi="Times New Roman" w:cs="Times New Roman"/>
+                <w:sz w:val="18"/>
+                <w:szCs w:val="18"/>
+              </w:rPr>
+              <w:t>– How to create or update a column with example.</w:t>
+            </w:r>
+          </w:p>
+          <w:p>
+            <w:pPr>
+              <w:ind w:left="6"/>
+              <w:rPr>
+                <w:rFonts w:ascii="Times New Roman" w:hAnsi="Times New Roman" w:cs="Times New Roman"/>
+                <w:sz w:val="18"/>
+                <w:szCs w:val="18"/>
+              </w:rPr>
+            </w:pPr>
+            <w:r>
+              <w:rPr>
+                <w:rFonts w:ascii="Times New Roman" w:hAnsi="Times New Roman" w:cs="Times New Roman"/>
+                <w:b/>
+                <w:bCs/>
+                <w:sz w:val="18"/>
+                <w:szCs w:val="18"/>
+              </w:rPr>
+              <w:t>Operation 3: Dropping Data (2 Marks)</w:t>
+            </w:r>
+            <w:r>
+              <w:rPr>
+                <w:rFonts w:ascii="Times New Roman" w:hAnsi="Times New Roman" w:cs="Times New Roman"/>
+                <w:b/>
+                <w:bCs/>
+                <w:sz w:val="18"/>
+                <w:szCs w:val="18"/>
+              </w:rPr>
+              <w:t xml:space="preserve"> </w:t>
+            </w:r>
+            <w:r>
+              <w:rPr>
+                <w:rFonts w:ascii="Times New Roman" w:hAnsi="Times New Roman" w:cs="Times New Roman"/>
+                <w:sz w:val="18"/>
+                <w:szCs w:val="18"/>
+              </w:rPr>
+              <w:t>– Use of .drop() to remove rows/columns with example.</w:t>
+            </w:r>
+          </w:p>
+          <w:p>
+            <w:pPr>
+              <w:ind w:left="6"/>
+              <w:rPr>
+                <w:rFonts w:ascii="Times New Roman" w:hAnsi="Times New Roman" w:cs="Times New Roman"/>
+                <w:sz w:val="18"/>
+                <w:szCs w:val="18"/>
+              </w:rPr>
+            </w:pPr>
+            <w:r>
+              <w:rPr>
+                <w:rFonts w:ascii="Times New Roman" w:hAnsi="Times New Roman" w:cs="Times New Roman"/>
+                <w:b/>
+                <w:bCs/>
+                <w:sz w:val="18"/>
+                <w:szCs w:val="18"/>
+              </w:rPr>
+              <w:t>Presentation / Conclusion (1 Mark)</w:t>
+            </w:r>
+            <w:r>
+              <w:rPr>
+                <w:rFonts w:ascii="Times New Roman" w:hAnsi="Times New Roman" w:cs="Times New Roman"/>
+                <w:sz w:val="18"/>
+                <w:szCs w:val="18"/>
+              </w:rPr>
+              <w:t xml:space="preserve"> – Clear format and summary of usefulness.</w:t>
+            </w:r>
+          </w:p>
+          <w:p>
+            <w:pPr>
+              <w:ind w:left="6"/>
+              <w:rPr>
+                <w:rFonts w:ascii="Times New Roman" w:hAnsi="Times New Roman" w:cs="Times New Roman"/>
+                <w:sz w:val="18"/>
+                <w:szCs w:val="18"/>
+              </w:rPr>
+            </w:pPr>
+          </w:p>
+          <w:p>
+            <w:pPr>
+              <w:ind w:left="6"/>
+              <w:rPr>
+                <w:rFonts w:ascii="Times New Roman" w:hAnsi="Times New Roman" w:cs="Times New Roman"/>
+                <w:sz w:val="18"/>
+                <w:szCs w:val="18"/>
+              </w:rPr>
+            </w:pPr>
+            <w:r>
+              <w:rPr>
+                <w:rFonts w:ascii="Times New Roman" w:hAnsi="Times New Roman" w:cs="Times New Roman"/>
+                <w:b/>
+                <w:bCs/>
+                <w:sz w:val="18"/>
+                <w:szCs w:val="18"/>
+              </w:rPr>
+              <w:t>Introduction (1 Mark)</w:t>
+            </w:r>
+            <w:r>
+              <w:rPr>
+                <w:rFonts w:ascii="Times New Roman" w:hAnsi="Times New Roman" w:cs="Times New Roman"/>
+                <w:sz w:val="18"/>
+                <w:szCs w:val="18"/>
+              </w:rPr>
+              <w:t xml:space="preserve"> – Purpose of data preprocessing.</w:t>
+            </w:r>
+          </w:p>
+          <w:p>
+            <w:pPr>
+              <w:ind w:left="6"/>
+              <w:rPr>
+                <w:rFonts w:ascii="Times New Roman" w:hAnsi="Times New Roman" w:cs="Times New Roman"/>
+                <w:sz w:val="18"/>
+                <w:szCs w:val="18"/>
+              </w:rPr>
+            </w:pPr>
+            <w:r>
+              <w:rPr>
+                <w:rFonts w:ascii="Times New Roman" w:hAnsi="Times New Roman" w:cs="Times New Roman"/>
+                <w:b/>
+                <w:bCs/>
+                <w:sz w:val="18"/>
+                <w:szCs w:val="18"/>
+              </w:rPr>
+              <w:t>Step 1: Handling Missing Data (1 Mark)</w:t>
+            </w:r>
+            <w:r>
+              <w:rPr>
+                <w:rFonts w:ascii="Times New Roman" w:hAnsi="Times New Roman" w:cs="Times New Roman"/>
+                <w:sz w:val="18"/>
+                <w:szCs w:val="18"/>
+              </w:rPr>
+              <w:t xml:space="preserve"> – e.g., </w:t>
+            </w:r>
+            <w:proofErr w:type="spellStart"/>
+            <w:r>
+              <w:rPr>
+                <w:rFonts w:ascii="Times New Roman" w:hAnsi="Times New Roman" w:cs="Times New Roman"/>
+                <w:sz w:val="18"/>
+                <w:szCs w:val="18"/>
+              </w:rPr>
+              <w:t>fillna</w:t>
+            </w:r>
+            <w:proofErr w:type="spellEnd"/>
+            <w:r>
+              <w:rPr>
+                <w:rFonts w:ascii="Times New Roman" w:hAnsi="Times New Roman" w:cs="Times New Roman"/>
+                <w:sz w:val="18"/>
+                <w:szCs w:val="18"/>
+              </w:rPr>
+              <w:t xml:space="preserve">() or </w:t>
+            </w:r>
+            <w:proofErr w:type="spellStart"/>
+            <w:r>
+              <w:rPr>
+                <w:rFonts w:ascii="Times New Roman" w:hAnsi="Times New Roman" w:cs="Times New Roman"/>
+                <w:sz w:val="18"/>
+                <w:szCs w:val="18"/>
+              </w:rPr>
+              <w:t>dropna</w:t>
+            </w:r>
+            <w:proofErr w:type="spellEnd"/>
+            <w:r>
+              <w:rPr>
+                <w:rFonts w:ascii="Times New Roman" w:hAnsi="Times New Roman" w:cs="Times New Roman"/>
+                <w:sz w:val="18"/>
+                <w:szCs w:val="18"/>
+              </w:rPr>
+              <w:t>()</w:t>
+            </w:r>
+          </w:p>
+          <w:p>
+            <w:pPr>
+              <w:ind w:left="6"/>
+              <w:rPr>
+                <w:rFonts w:ascii="Times New Roman" w:hAnsi="Times New Roman" w:cs="Times New Roman"/>
+                <w:sz w:val="18"/>
+                <w:szCs w:val="18"/>
+              </w:rPr>
+            </w:pPr>
+            <w:r>
+              <w:rPr>
+                <w:rFonts w:ascii="Times New Roman" w:hAnsi="Times New Roman" w:cs="Times New Roman"/>
+                <w:b/>
+                <w:bCs/>
+                <w:sz w:val="18"/>
+                <w:szCs w:val="18"/>
+              </w:rPr>
+              <w:t>Step 2: Encoding Categorical Data (1 Mark)</w:t>
+            </w:r>
+            <w:r>
+              <w:rPr>
+                <w:rFonts w:ascii="Times New Roman" w:hAnsi="Times New Roman" w:cs="Times New Roman"/>
+                <w:sz w:val="18"/>
+                <w:szCs w:val="18"/>
+              </w:rPr>
+              <w:t xml:space="preserve"> – e.g., </w:t>
+            </w:r>
+            <w:proofErr w:type="spellStart"/>
+            <w:r>
+              <w:rPr>
+                <w:rFonts w:ascii="Times New Roman" w:hAnsi="Times New Roman" w:cs="Times New Roman"/>
+                <w:sz w:val="18"/>
+                <w:szCs w:val="18"/>
+              </w:rPr>
+              <w:t>get_dummies</w:t>
+            </w:r>
+            <w:proofErr w:type="spellEnd"/>
+            <w:r>
+              <w:rPr>
+                <w:rFonts w:ascii="Times New Roman" w:hAnsi="Times New Roman" w:cs="Times New Roman"/>
+                <w:sz w:val="18"/>
+                <w:szCs w:val="18"/>
+              </w:rPr>
+              <w:t xml:space="preserve">() or </w:t>
+            </w:r>
+            <w:proofErr w:type="spellStart"/>
+            <w:r>
+              <w:rPr>
+                <w:rFonts w:ascii="Times New Roman" w:hAnsi="Times New Roman" w:cs="Times New Roman"/>
+                <w:sz w:val="18"/>
+                <w:szCs w:val="18"/>
+              </w:rPr>
+              <w:t>LabelEncoder</w:t>
+            </w:r>
+            <w:proofErr w:type="spellEnd"/>
+          </w:p>
+          <w:p>
+            <w:pPr>
+              <w:ind w:left="6"/>
+              <w:rPr>
+                <w:rFonts w:ascii="Times New Roman" w:hAnsi="Times New Roman" w:cs="Times New Roman"/>
+                <w:sz w:val="18"/>
+                <w:szCs w:val="18"/>
+              </w:rPr>
+            </w:pPr>
+            <w:r>
+              <w:rPr>
+                <w:rFonts w:ascii="Times New Roman" w:hAnsi="Times New Roman" w:cs="Times New Roman"/>
+                <w:b/>
+                <w:bCs/>
+                <w:sz w:val="18"/>
+                <w:szCs w:val="18"/>
+              </w:rPr>
+              <w:t>Step 3: Feature Scaling (1 Mark)</w:t>
+            </w:r>
+            <w:r>
+              <w:rPr>
+                <w:rFonts w:ascii="Times New Roman" w:hAnsi="Times New Roman" w:cs="Times New Roman"/>
+                <w:sz w:val="18"/>
+                <w:szCs w:val="18"/>
+              </w:rPr>
+              <w:t xml:space="preserve"> – e.g., </w:t>
+            </w:r>
+            <w:proofErr w:type="spellStart"/>
+            <w:r>
+              <w:rPr>
+                <w:rFonts w:ascii="Times New Roman" w:hAnsi="Times New Roman" w:cs="Times New Roman"/>
+                <w:sz w:val="18"/>
+                <w:szCs w:val="18"/>
+              </w:rPr>
+              <w:t>StandardScaler</w:t>
+            </w:r>
+            <w:proofErr w:type="spellEnd"/>
+          </w:p>
+          <w:p>
+            <w:pPr>
+              <w:ind w:left="6"/>
+              <w:rPr>
+                <w:rFonts w:ascii="Times New Roman" w:hAnsi="Times New Roman" w:cs="Times New Roman"/>
+                <w:sz w:val="18"/>
+                <w:szCs w:val="18"/>
+              </w:rPr>
+            </w:pPr>
+            <w:r>
+              <w:rPr>
+                <w:rFonts w:ascii="Times New Roman" w:hAnsi="Times New Roman" w:cs="Times New Roman"/>
+                <w:b/>
+                <w:bCs/>
+                <w:sz w:val="18"/>
+                <w:szCs w:val="18"/>
+              </w:rPr>
+              <w:t>Step 4: Train-Test Split (1 Mark)</w:t>
+            </w:r>
+            <w:r>
+              <w:rPr>
+                <w:rFonts w:ascii="Times New Roman" w:hAnsi="Times New Roman" w:cs="Times New Roman"/>
+                <w:sz w:val="18"/>
+                <w:szCs w:val="18"/>
+              </w:rPr>
+              <w:t xml:space="preserve"> – e.g., </w:t>
+            </w:r>
+            <w:proofErr w:type="spellStart"/>
+            <w:r>
+              <w:rPr>
+                <w:rFonts w:ascii="Times New Roman" w:hAnsi="Times New Roman" w:cs="Times New Roman"/>
+                <w:sz w:val="18"/>
+                <w:szCs w:val="18"/>
+              </w:rPr>
+              <w:t>train_test_split</w:t>
+            </w:r>
+            <w:proofErr w:type="spellEnd"/>
+            <w:r>
+              <w:rPr>
+                <w:rFonts w:ascii="Times New Roman" w:hAnsi="Times New Roman" w:cs="Times New Roman"/>
+                <w:sz w:val="18"/>
+                <w:szCs w:val="18"/>
+              </w:rPr>
+              <w:t>()</w:t>
+            </w:r>
+          </w:p>
+          <w:p>
+            <w:pPr>
+              <w:ind w:left="6"/>
+              <w:rPr>
+                <w:rFonts w:ascii="Times New Roman" w:hAnsi="Times New Roman" w:cs="Times New Roman"/>
+                <w:sz w:val="18"/>
+                <w:szCs w:val="18"/>
+              </w:rPr>
+            </w:pPr>
+            <w:r>
+              <w:rPr>
+                <w:rFonts w:ascii="Times New Roman" w:hAnsi="Times New Roman" w:cs="Times New Roman"/>
+                <w:b/>
+                <w:bCs/>
+                <w:sz w:val="18"/>
+                <w:szCs w:val="18"/>
+              </w:rPr>
+              <w:t>Example Covering Steps (1 Mark)</w:t>
+            </w:r>
+            <w:r>
+              <w:rPr>
+                <w:rFonts w:ascii="Times New Roman" w:hAnsi="Times New Roman" w:cs="Times New Roman"/>
+                <w:sz w:val="18"/>
+                <w:szCs w:val="18"/>
+              </w:rPr>
+              <w:t xml:space="preserve"> – Small code snippet or flow.</w:t>
+            </w:r>
+          </w:p>
+          <w:p>
+            <w:pPr>
+              <w:ind w:left="6"/>
+              <w:rPr>
+                <w:rFonts w:ascii="Times New Roman" w:hAnsi="Times New Roman" w:cs="Times New Roman"/>
+                <w:sz w:val="18"/>
+                <w:szCs w:val="18"/>
+              </w:rPr>
+            </w:pPr>
+            <w:r>
+              <w:rPr>
+                <w:rFonts w:ascii="Times New Roman" w:hAnsi="Times New Roman" w:cs="Times New Roman"/>
+                <w:b/>
+                <w:bCs/>
+                <w:sz w:val="18"/>
+                <w:szCs w:val="18"/>
+              </w:rPr>
+              <w:t>Presentation / Conclusion (1 Mark)</w:t>
+            </w:r>
+            <w:r>
+              <w:rPr>
+                <w:rFonts w:ascii="Times New Roman" w:hAnsi="Times New Roman" w:cs="Times New Roman"/>
+                <w:sz w:val="18"/>
+                <w:szCs w:val="18"/>
+              </w:rPr>
+              <w:t xml:space="preserve"> – Clear steps and neat structure.</w:t>
+            </w:r>
+          </w:p>
+        </w:tc>
+        <w:tc>
+          <w:tcPr>
+            <w:tcW w:w="1276" w:type="dxa"/>
+            <w:tcBorders>
+              <w:top w:val="single" w:sz="4" w:space="0" w:color="000000"/>
+              <w:left w:val="single" w:sz="4" w:space="0" w:color="000000"/>
+              <w:bottom w:val="single" w:sz="4" w:space="0" w:color="000000"/>
+              <w:right w:val="single" w:sz="4" w:space="0" w:color="000000"/>
+            </w:tcBorders>
+          </w:tcPr>
+          <w:p>
+            <w:pPr>
+              <w:ind w:left="8"/>
+              <w:rPr>
+                <w:rFonts w:ascii="Times New Roman" w:hAnsi="Times New Roman" w:cs="Times New Roman"/>
+                <w:sz w:val="18"/>
+                <w:szCs w:val="18"/>
+              </w:rPr>
+            </w:pPr>
+            <w:r>
+              <w:rPr>
+                <w:rFonts w:ascii="Times New Roman" w:hAnsi="Times New Roman" w:cs="Times New Roman"/>
+                <w:sz w:val="18"/>
+                <w:szCs w:val="18"/>
+              </w:rPr>
+              <w:t xml:space="preserve"> </w:t>
+            </w:r>
+          </w:p>
+          <w:p>
+            <w:pPr>
+              <w:ind w:left="8"/>
+              <w:rPr>
+                <w:rFonts w:ascii="Times New Roman" w:hAnsi="Times New Roman" w:cs="Times New Roman"/>
+                <w:sz w:val="18"/>
+                <w:szCs w:val="18"/>
+              </w:rPr>
+            </w:pPr>
+            <w:r>
+              <w:rPr>
+                <w:rFonts w:ascii="Times New Roman" w:hAnsi="Times New Roman" w:cs="Times New Roman"/>
+                <w:sz w:val="18"/>
+                <w:szCs w:val="18"/>
+              </w:rPr>
+              <w:t xml:space="preserve">8M </w:t>
+            </w:r>
+          </w:p>
+          <w:p>
+            <w:pPr>
+              <w:ind w:left="8"/>
+              <w:rPr>
+                <w:rFonts w:ascii="Times New Roman" w:hAnsi="Times New Roman" w:cs="Times New Roman"/>
+                <w:sz w:val="18"/>
+                <w:szCs w:val="18"/>
+              </w:rPr>
+            </w:pPr>
+            <w:r>
+              <w:rPr>
+                <w:rFonts w:ascii="Times New Roman" w:hAnsi="Times New Roman" w:cs="Times New Roman"/>
+                <w:sz w:val="18"/>
+                <w:szCs w:val="18"/>
+              </w:rPr>
+              <w:t xml:space="preserve"> </w:t>
+            </w:r>
+          </w:p>
+          <w:p>
+            <w:pPr>
+              <w:ind w:left="8"/>
+              <w:rPr>
+                <w:rFonts w:ascii="Times New Roman" w:hAnsi="Times New Roman" w:cs="Times New Roman"/>
+                <w:sz w:val="18"/>
+                <w:szCs w:val="18"/>
+              </w:rPr>
+            </w:pPr>
+            <w:r>
+              <w:rPr>
+                <w:rFonts w:ascii="Times New Roman" w:hAnsi="Times New Roman" w:cs="Times New Roman"/>
+                <w:sz w:val="18"/>
+                <w:szCs w:val="18"/>
+              </w:rPr>
+              <w:t xml:space="preserve"> </w:t>
+            </w:r>
+          </w:p>
+          <w:p>
+            <w:pPr>
+              <w:ind w:left="8"/>
+              <w:rPr>
+                <w:rFonts w:ascii="Times New Roman" w:hAnsi="Times New Roman" w:cs="Times New Roman"/>
+                <w:sz w:val="18"/>
+                <w:szCs w:val="18"/>
+              </w:rPr>
+            </w:pPr>
+          </w:p>
+          <w:p>
+            <w:pPr>
+              <w:ind w:left="8"/>
+              <w:rPr>
+                <w:rFonts w:ascii="Times New Roman" w:hAnsi="Times New Roman" w:cs="Times New Roman"/>
+                <w:sz w:val="18"/>
+                <w:szCs w:val="18"/>
+              </w:rPr>
+            </w:pPr>
+          </w:p>
+          <w:p>
+            <w:pPr>
+              <w:ind w:left="8"/>
+              <w:rPr>
+                <w:rFonts w:ascii="Times New Roman" w:hAnsi="Times New Roman" w:cs="Times New Roman"/>
+                <w:sz w:val="18"/>
+                <w:szCs w:val="18"/>
+              </w:rPr>
+            </w:pPr>
+          </w:p>
+          <w:p>
+            <w:pPr>
+              <w:ind w:left="8"/>
+              <w:rPr>
+                <w:rFonts w:ascii="Times New Roman" w:hAnsi="Times New Roman" w:cs="Times New Roman"/>
+                <w:sz w:val="18"/>
+                <w:szCs w:val="18"/>
+              </w:rPr>
+            </w:pPr>
+          </w:p>
+          <w:p>
+            <w:pPr>
+              <w:ind w:left="8"/>
+              <w:rPr>
+                <w:rFonts w:ascii="Times New Roman" w:hAnsi="Times New Roman" w:cs="Times New Roman"/>
+                <w:sz w:val="18"/>
+                <w:szCs w:val="18"/>
+              </w:rPr>
+            </w:pPr>
+          </w:p>
+          <w:p>
+            <w:pPr>
+              <w:ind w:left="8"/>
+              <w:rPr>
+                <w:rFonts w:ascii="Times New Roman" w:hAnsi="Times New Roman" w:cs="Times New Roman"/>
+                <w:sz w:val="18"/>
+                <w:szCs w:val="18"/>
+              </w:rPr>
+            </w:pPr>
+            <w:r>
+              <w:rPr>
+                <w:rFonts w:ascii="Times New Roman" w:hAnsi="Times New Roman" w:cs="Times New Roman"/>
+                <w:sz w:val="18"/>
+                <w:szCs w:val="18"/>
+              </w:rPr>
+              <w:t xml:space="preserve">7M </w:t>
+            </w:r>
+          </w:p>
+        </w:tc>
+      </w:tr>
+      <w:tr>
+        <w:trPr>
+          <w:trHeight w:val="286"/>
+        </w:trPr>
+        <w:tc>
+          <w:tcPr>
+            <w:tcW w:w="977" w:type="dxa"/>
+            <w:tcBorders>
+              <w:top w:val="single" w:sz="4" w:space="0" w:color="000000"/>
+              <w:left w:val="single" w:sz="4" w:space="0" w:color="000000"/>
+              <w:bottom w:val="single" w:sz="4" w:space="0" w:color="000000"/>
+              <w:right w:val="single" w:sz="4" w:space="0" w:color="000000"/>
+            </w:tcBorders>
+          </w:tcPr>
+          <w:p>
+            <w:pPr>
+              <w:ind w:left="8"/>
+              <w:rPr>
+                <w:rFonts w:ascii="Times New Roman" w:hAnsi="Times New Roman" w:cs="Times New Roman"/>
+              </w:rPr>
+            </w:pPr>
+            <w:r>
+              <w:rPr>
+                <w:rFonts w:ascii="Times New Roman" w:hAnsi="Times New Roman" w:cs="Times New Roman"/>
+              </w:rPr>
+              <w:t xml:space="preserve"> </w:t>
+            </w:r>
+          </w:p>
+        </w:tc>
+        <w:tc>
+          <w:tcPr>
+            <w:tcW w:w="555" w:type="dxa"/>
+            <w:tcBorders>
+              <w:top w:val="single" w:sz="4" w:space="0" w:color="000000"/>
+              <w:left w:val="single" w:sz="4" w:space="0" w:color="000000"/>
+              <w:bottom w:val="single" w:sz="4" w:space="0" w:color="000000"/>
+              <w:right w:val="single" w:sz="4" w:space="0" w:color="000000"/>
+            </w:tcBorders>
+          </w:tcPr>
+          <w:p>
+            <w:pPr>
+              <w:rPr>
+                <w:rFonts w:ascii="Times New Roman" w:hAnsi="Times New Roman" w:cs="Times New Roman"/>
+              </w:rPr>
+            </w:pPr>
+            <w:r>
+              <w:rPr>
+                <w:rFonts w:ascii="Times New Roman" w:hAnsi="Times New Roman" w:cs="Times New Roman"/>
+              </w:rPr>
+              <w:t xml:space="preserve"> </w:t>
+            </w:r>
+          </w:p>
+        </w:tc>
+        <w:tc>
+          <w:tcPr>
+            <w:tcW w:w="8032" w:type="dxa"/>
+            <w:tcBorders>
+              <w:top w:val="single" w:sz="4" w:space="0" w:color="000000"/>
+              <w:left w:val="single" w:sz="4" w:space="0" w:color="000000"/>
+              <w:bottom w:val="single" w:sz="4" w:space="0" w:color="000000"/>
+              <w:right w:val="single" w:sz="4" w:space="0" w:color="000000"/>
+            </w:tcBorders>
+          </w:tcPr>
+          <w:p>
+            <w:pPr>
+              <w:ind w:right="78"/>
+              <w:jc w:val="center"/>
+              <w:rPr>
+                <w:rFonts w:ascii="Times New Roman" w:hAnsi="Times New Roman" w:cs="Times New Roman"/>
+                <w:sz w:val="18"/>
+                <w:szCs w:val="18"/>
+              </w:rPr>
+            </w:pPr>
+            <w:r>
+              <w:rPr>
+                <w:rFonts w:ascii="Times New Roman" w:hAnsi="Times New Roman" w:cs="Times New Roman"/>
+                <w:sz w:val="18"/>
+                <w:szCs w:val="18"/>
+              </w:rPr>
+              <w:t xml:space="preserve">OR </w:t>
+            </w:r>
+          </w:p>
+        </w:tc>
+        <w:tc>
+          <w:tcPr>
+            <w:tcW w:w="1276" w:type="dxa"/>
+            <w:tcBorders>
+              <w:top w:val="single" w:sz="4" w:space="0" w:color="000000"/>
+              <w:left w:val="single" w:sz="4" w:space="0" w:color="000000"/>
+              <w:bottom w:val="single" w:sz="4" w:space="0" w:color="000000"/>
+              <w:right w:val="single" w:sz="4" w:space="0" w:color="000000"/>
+            </w:tcBorders>
+          </w:tcPr>
+          <w:p>
+            <w:pPr>
+              <w:ind w:left="8"/>
+              <w:rPr>
+                <w:rFonts w:ascii="Times New Roman" w:hAnsi="Times New Roman" w:cs="Times New Roman"/>
+                <w:sz w:val="18"/>
+                <w:szCs w:val="18"/>
+              </w:rPr>
+            </w:pPr>
+            <w:r>
+              <w:rPr>
+                <w:rFonts w:ascii="Times New Roman" w:hAnsi="Times New Roman" w:cs="Times New Roman"/>
+                <w:sz w:val="18"/>
+                <w:szCs w:val="18"/>
+              </w:rPr>
+              <w:t xml:space="preserve"> </w:t>
+            </w:r>
+          </w:p>
+        </w:tc>
+      </w:tr>
+      <w:tr>
+        <w:trPr>
+          <w:trHeight w:val="2089"/>
+        </w:trPr>
+        <w:tc>
+          <w:tcPr>
+            <w:tcW w:w="977" w:type="dxa"/>
+            <w:tcBorders>
+              <w:top w:val="single" w:sz="4" w:space="0" w:color="000000"/>
+              <w:left w:val="single" w:sz="4" w:space="0" w:color="000000"/>
+              <w:bottom w:val="single" w:sz="4" w:space="0" w:color="000000"/>
+              <w:right w:val="single" w:sz="4" w:space="0" w:color="000000"/>
+            </w:tcBorders>
+          </w:tcPr>
+          <w:p>
+            <w:pPr>
+              <w:ind w:left="8"/>
+              <w:rPr>
+                <w:rFonts w:ascii="Times New Roman" w:hAnsi="Times New Roman" w:cs="Times New Roman"/>
+              </w:rPr>
+            </w:pPr>
+            <w:r>
+              <w:rPr>
+                <w:rFonts w:ascii="Times New Roman" w:hAnsi="Times New Roman" w:cs="Times New Roman"/>
+              </w:rPr>
+              <w:t xml:space="preserve"> </w:t>
+            </w:r>
+          </w:p>
+          <w:p>
+            <w:pPr>
+              <w:ind w:left="8"/>
+              <w:rPr>
+                <w:rFonts w:ascii="Times New Roman" w:hAnsi="Times New Roman" w:cs="Times New Roman"/>
+              </w:rPr>
+            </w:pPr>
+            <w:r>
+              <w:rPr>
+                <w:rFonts w:ascii="Times New Roman" w:hAnsi="Times New Roman" w:cs="Times New Roman"/>
+              </w:rPr>
+              <w:t xml:space="preserve">4 </w:t>
+            </w:r>
+          </w:p>
+        </w:tc>
+        <w:tc>
+          <w:tcPr>
+            <w:tcW w:w="555" w:type="dxa"/>
+            <w:tcBorders>
+              <w:top w:val="single" w:sz="4" w:space="0" w:color="000000"/>
+              <w:left w:val="single" w:sz="4" w:space="0" w:color="000000"/>
+              <w:bottom w:val="single" w:sz="4" w:space="0" w:color="000000"/>
+              <w:right w:val="single" w:sz="4" w:space="0" w:color="000000"/>
+            </w:tcBorders>
+          </w:tcPr>
+          <w:p>
+            <w:pPr>
+              <w:rPr>
+                <w:rFonts w:ascii="Times New Roman" w:hAnsi="Times New Roman" w:cs="Times New Roman"/>
+              </w:rPr>
+            </w:pPr>
+            <w:r>
+              <w:rPr>
+                <w:rFonts w:ascii="Times New Roman" w:hAnsi="Times New Roman" w:cs="Times New Roman"/>
+              </w:rPr>
+              <w:t>7</w:t>
+            </w:r>
+          </w:p>
+          <w:p>
+            <w:pPr>
+              <w:rPr>
+                <w:rFonts w:ascii="Times New Roman" w:hAnsi="Times New Roman" w:cs="Times New Roman"/>
+              </w:rPr>
+            </w:pPr>
+          </w:p>
+          <w:p>
+            <w:pPr>
+              <w:rPr>
+                <w:rFonts w:ascii="Times New Roman" w:hAnsi="Times New Roman" w:cs="Times New Roman"/>
+              </w:rPr>
+            </w:pPr>
+          </w:p>
+          <w:p>
+            <w:pPr>
+              <w:rPr>
+                <w:rFonts w:ascii="Times New Roman" w:hAnsi="Times New Roman" w:cs="Times New Roman"/>
+              </w:rPr>
+            </w:pPr>
+            <w:r>
+              <w:rPr>
+                <w:rFonts w:ascii="Times New Roman" w:hAnsi="Times New Roman" w:cs="Times New Roman"/>
+              </w:rPr>
+              <w:t xml:space="preserve">8 </w:t>
+            </w:r>
+          </w:p>
+          <w:p>
+            <w:pPr>
+              <w:rPr>
+                <w:rFonts w:ascii="Times New Roman" w:hAnsi="Times New Roman" w:cs="Times New Roman"/>
+              </w:rPr>
+            </w:pPr>
+          </w:p>
+        </w:tc>
+        <w:tc>
+          <w:tcPr>
+            <w:tcW w:w="8032" w:type="dxa"/>
+            <w:tcBorders>
+              <w:top w:val="single" w:sz="4" w:space="0" w:color="000000"/>
+              <w:left w:val="single" w:sz="4" w:space="0" w:color="000000"/>
+              <w:bottom w:val="single" w:sz="4" w:space="0" w:color="000000"/>
+              <w:right w:val="single" w:sz="4" w:space="0" w:color="000000"/>
+            </w:tcBorders>
+          </w:tcPr>
+          <w:p>
+            <w:pPr>
+              <w:ind w:left="6"/>
+              <w:rPr>
+                <w:rFonts w:ascii="Times New Roman" w:hAnsi="Times New Roman" w:cs="Times New Roman"/>
+                <w:sz w:val="18"/>
+                <w:szCs w:val="18"/>
+              </w:rPr>
+            </w:pPr>
+            <w:r>
+              <w:rPr>
+                <w:rFonts w:ascii="Times New Roman" w:hAnsi="Times New Roman" w:cs="Times New Roman"/>
+                <w:b/>
+                <w:bCs/>
+                <w:sz w:val="18"/>
+                <w:szCs w:val="18"/>
+              </w:rPr>
+              <w:t>NumPy (2 Marks)</w:t>
+            </w:r>
+            <w:r>
+              <w:rPr>
+                <w:rFonts w:ascii="Times New Roman" w:hAnsi="Times New Roman" w:cs="Times New Roman"/>
+                <w:sz w:val="18"/>
+                <w:szCs w:val="18"/>
+              </w:rPr>
+              <w:t xml:space="preserve"> – Use + small code (e.g., array creation, operations).</w:t>
+            </w:r>
+          </w:p>
+          <w:p>
+            <w:pPr>
+              <w:ind w:left="6"/>
+              <w:rPr>
+                <w:rFonts w:ascii="Times New Roman" w:hAnsi="Times New Roman" w:cs="Times New Roman"/>
+                <w:sz w:val="18"/>
+                <w:szCs w:val="18"/>
+              </w:rPr>
+            </w:pPr>
+            <w:r>
+              <w:rPr>
+                <w:rFonts w:ascii="Times New Roman" w:hAnsi="Times New Roman" w:cs="Times New Roman"/>
+                <w:b/>
+                <w:bCs/>
+                <w:sz w:val="18"/>
+                <w:szCs w:val="18"/>
+              </w:rPr>
+              <w:t>Pandas (2 Marks)</w:t>
+            </w:r>
+            <w:r>
+              <w:rPr>
+                <w:rFonts w:ascii="Times New Roman" w:hAnsi="Times New Roman" w:cs="Times New Roman"/>
+                <w:sz w:val="18"/>
+                <w:szCs w:val="18"/>
+              </w:rPr>
+              <w:t xml:space="preserve"> – Use + code (e.g., read CSV, filter data).</w:t>
+            </w:r>
+          </w:p>
+          <w:p>
+            <w:pPr>
+              <w:ind w:left="6"/>
+              <w:rPr>
+                <w:rFonts w:ascii="Times New Roman" w:hAnsi="Times New Roman" w:cs="Times New Roman"/>
+                <w:sz w:val="18"/>
+                <w:szCs w:val="18"/>
+              </w:rPr>
+            </w:pPr>
+            <w:r>
+              <w:rPr>
+                <w:rFonts w:ascii="Times New Roman" w:hAnsi="Times New Roman" w:cs="Times New Roman"/>
+                <w:b/>
+                <w:bCs/>
+                <w:sz w:val="18"/>
+                <w:szCs w:val="18"/>
+              </w:rPr>
+              <w:t>Matplotlib (</w:t>
+            </w:r>
+            <w:r>
+              <w:rPr>
+                <w:rFonts w:ascii="Times New Roman" w:hAnsi="Times New Roman" w:cs="Times New Roman"/>
+                <w:b/>
+                <w:bCs/>
+                <w:sz w:val="18"/>
+                <w:szCs w:val="18"/>
+              </w:rPr>
+              <w:t>1</w:t>
+            </w:r>
+            <w:r>
+              <w:rPr>
+                <w:rFonts w:ascii="Times New Roman" w:hAnsi="Times New Roman" w:cs="Times New Roman"/>
+                <w:b/>
+                <w:bCs/>
+                <w:sz w:val="18"/>
+                <w:szCs w:val="18"/>
+              </w:rPr>
+              <w:t xml:space="preserve"> Marks)</w:t>
+            </w:r>
+            <w:r>
+              <w:rPr>
+                <w:rFonts w:ascii="Times New Roman" w:hAnsi="Times New Roman" w:cs="Times New Roman"/>
+                <w:sz w:val="18"/>
+                <w:szCs w:val="18"/>
+              </w:rPr>
+              <w:t xml:space="preserve"> – Use + code (e.g., plot graph/chart).</w:t>
+            </w:r>
+          </w:p>
+          <w:p>
+            <w:pPr>
+              <w:ind w:left="6"/>
+              <w:rPr>
+                <w:rFonts w:ascii="Times New Roman" w:hAnsi="Times New Roman" w:cs="Times New Roman"/>
+                <w:sz w:val="18"/>
+                <w:szCs w:val="18"/>
+              </w:rPr>
+            </w:pPr>
+          </w:p>
+          <w:p>
+            <w:pPr>
+              <w:ind w:left="6"/>
+              <w:rPr>
+                <w:rFonts w:ascii="Times New Roman" w:hAnsi="Times New Roman" w:cs="Times New Roman"/>
+                <w:sz w:val="18"/>
+                <w:szCs w:val="18"/>
+              </w:rPr>
+            </w:pPr>
+            <w:r>
+              <w:rPr>
+                <w:rFonts w:ascii="Times New Roman" w:hAnsi="Times New Roman" w:cs="Times New Roman"/>
+                <w:b/>
+                <w:bCs/>
+                <w:sz w:val="18"/>
+                <w:szCs w:val="18"/>
+              </w:rPr>
+              <w:t>Definition of NumPy (1 Mark)</w:t>
+            </w:r>
+            <w:r>
+              <w:rPr>
+                <w:rFonts w:ascii="Times New Roman" w:hAnsi="Times New Roman" w:cs="Times New Roman"/>
+                <w:sz w:val="18"/>
+                <w:szCs w:val="18"/>
+              </w:rPr>
+              <w:t xml:space="preserve"> – What it is.</w:t>
+            </w:r>
+          </w:p>
+          <w:p>
+            <w:pPr>
+              <w:ind w:left="6"/>
+              <w:rPr>
+                <w:rFonts w:ascii="Times New Roman" w:hAnsi="Times New Roman" w:cs="Times New Roman"/>
+                <w:sz w:val="18"/>
+                <w:szCs w:val="18"/>
+              </w:rPr>
+            </w:pPr>
+            <w:r>
+              <w:rPr>
+                <w:rFonts w:ascii="Times New Roman" w:hAnsi="Times New Roman" w:cs="Times New Roman"/>
+                <w:b/>
+                <w:bCs/>
+                <w:sz w:val="18"/>
+                <w:szCs w:val="18"/>
+              </w:rPr>
+              <w:t>Importance in Data Analysis (2 Marks)</w:t>
+            </w:r>
+            <w:r>
+              <w:rPr>
+                <w:rFonts w:ascii="Times New Roman" w:hAnsi="Times New Roman" w:cs="Times New Roman"/>
+                <w:sz w:val="18"/>
+                <w:szCs w:val="18"/>
+              </w:rPr>
+              <w:t xml:space="preserve"> – Speed, efficiency, large data handling.</w:t>
+            </w:r>
+          </w:p>
+          <w:p>
+            <w:pPr>
+              <w:tabs>
+                <w:tab w:val="num" w:pos="720"/>
+              </w:tabs>
+              <w:ind w:left="6"/>
+              <w:rPr>
+                <w:rFonts w:ascii="Times New Roman" w:hAnsi="Times New Roman" w:cs="Times New Roman"/>
+                <w:sz w:val="18"/>
+                <w:szCs w:val="18"/>
+              </w:rPr>
+            </w:pPr>
+            <w:r>
+              <w:rPr>
+                <w:rFonts w:ascii="Times New Roman" w:hAnsi="Times New Roman" w:cs="Times New Roman"/>
+                <w:b/>
+                <w:bCs/>
+                <w:sz w:val="18"/>
+                <w:szCs w:val="18"/>
+              </w:rPr>
+              <w:t>Any 4 Operations with examples (6 Marks)</w:t>
+            </w:r>
+            <w:r>
+              <w:rPr>
+                <w:rFonts w:ascii="Times New Roman" w:hAnsi="Times New Roman" w:cs="Times New Roman"/>
+                <w:sz w:val="18"/>
+                <w:szCs w:val="18"/>
+              </w:rPr>
+              <w:t xml:space="preserve"> –Array creation</w:t>
+            </w:r>
+            <w:r>
+              <w:rPr>
+                <w:rFonts w:ascii="Times New Roman" w:hAnsi="Times New Roman" w:cs="Times New Roman"/>
+                <w:sz w:val="18"/>
+                <w:szCs w:val="18"/>
+              </w:rPr>
+              <w:t xml:space="preserve">, </w:t>
+            </w:r>
+            <w:r>
+              <w:rPr>
+                <w:rFonts w:ascii="Times New Roman" w:hAnsi="Times New Roman" w:cs="Times New Roman"/>
+                <w:sz w:val="18"/>
+                <w:szCs w:val="18"/>
+              </w:rPr>
+              <w:t>Indexing/slicing</w:t>
+            </w:r>
+            <w:r>
+              <w:rPr>
+                <w:rFonts w:ascii="Times New Roman" w:hAnsi="Times New Roman" w:cs="Times New Roman"/>
+                <w:sz w:val="18"/>
+                <w:szCs w:val="18"/>
+              </w:rPr>
+              <w:t xml:space="preserve">, </w:t>
+            </w:r>
+            <w:r>
+              <w:rPr>
+                <w:rFonts w:ascii="Times New Roman" w:hAnsi="Times New Roman" w:cs="Times New Roman"/>
+                <w:sz w:val="18"/>
+                <w:szCs w:val="18"/>
+              </w:rPr>
+              <w:t>Mathematical functions</w:t>
+            </w:r>
+            <w:r>
+              <w:rPr>
+                <w:rFonts w:ascii="Times New Roman" w:hAnsi="Times New Roman" w:cs="Times New Roman"/>
+                <w:sz w:val="18"/>
+                <w:szCs w:val="18"/>
+              </w:rPr>
+              <w:t xml:space="preserve">, </w:t>
+            </w:r>
+            <w:r>
+              <w:rPr>
+                <w:rFonts w:ascii="Times New Roman" w:hAnsi="Times New Roman" w:cs="Times New Roman"/>
+                <w:sz w:val="18"/>
+                <w:szCs w:val="18"/>
+              </w:rPr>
+              <w:t>Reshaping arrays</w:t>
+            </w:r>
+            <w:r>
+              <w:rPr>
+                <w:rFonts w:ascii="Times New Roman" w:hAnsi="Times New Roman" w:cs="Times New Roman"/>
+                <w:sz w:val="18"/>
+                <w:szCs w:val="18"/>
+              </w:rPr>
+              <w:t xml:space="preserve"> - </w:t>
+            </w:r>
+            <w:r>
+              <w:rPr>
+                <w:rFonts w:ascii="Times New Roman" w:hAnsi="Times New Roman" w:cs="Times New Roman"/>
+                <w:i/>
+                <w:iCs/>
+                <w:sz w:val="18"/>
+                <w:szCs w:val="18"/>
+              </w:rPr>
+              <w:t>(1.5 marks each)</w:t>
+            </w:r>
+          </w:p>
+          <w:p>
+            <w:pPr>
+              <w:ind w:left="6"/>
+              <w:rPr>
+                <w:rFonts w:ascii="Times New Roman" w:hAnsi="Times New Roman" w:cs="Times New Roman"/>
+                <w:sz w:val="18"/>
+                <w:szCs w:val="18"/>
+              </w:rPr>
+            </w:pPr>
+            <w:r>
+              <w:rPr>
+                <w:rFonts w:ascii="Times New Roman" w:hAnsi="Times New Roman" w:cs="Times New Roman"/>
+                <w:b/>
+                <w:bCs/>
+                <w:sz w:val="18"/>
+                <w:szCs w:val="18"/>
+              </w:rPr>
+              <w:t>Presentation / Conclusion (1 Mark)</w:t>
+            </w:r>
+            <w:r>
+              <w:rPr>
+                <w:rFonts w:ascii="Times New Roman" w:hAnsi="Times New Roman" w:cs="Times New Roman"/>
+                <w:sz w:val="18"/>
+                <w:szCs w:val="18"/>
+              </w:rPr>
+              <w:t xml:space="preserve"> – Clear structure, neat examples.</w:t>
+            </w:r>
+          </w:p>
+          <w:p>
+            <w:pPr>
+              <w:ind w:left="6"/>
+              <w:rPr>
+                <w:rFonts w:ascii="Times New Roman" w:hAnsi="Times New Roman" w:cs="Times New Roman"/>
+                <w:sz w:val="18"/>
+                <w:szCs w:val="18"/>
+              </w:rPr>
+            </w:pPr>
+          </w:p>
+        </w:tc>
+        <w:tc>
+          <w:tcPr>
+            <w:tcW w:w="1276" w:type="dxa"/>
+            <w:tcBorders>
+              <w:top w:val="single" w:sz="4" w:space="0" w:color="000000"/>
+              <w:left w:val="single" w:sz="4" w:space="0" w:color="000000"/>
+              <w:bottom w:val="single" w:sz="4" w:space="0" w:color="000000"/>
+              <w:right w:val="single" w:sz="4" w:space="0" w:color="000000"/>
+            </w:tcBorders>
+          </w:tcPr>
+          <w:p>
+            <w:pPr>
+              <w:ind w:left="8"/>
+              <w:rPr>
+                <w:rFonts w:ascii="Times New Roman" w:hAnsi="Times New Roman" w:cs="Times New Roman"/>
+                <w:sz w:val="18"/>
+                <w:szCs w:val="18"/>
+              </w:rPr>
+            </w:pPr>
+            <w:r>
+              <w:rPr>
+                <w:rFonts w:ascii="Times New Roman" w:hAnsi="Times New Roman" w:cs="Times New Roman"/>
+                <w:sz w:val="18"/>
+                <w:szCs w:val="18"/>
+              </w:rPr>
+              <w:t xml:space="preserve">5M </w:t>
+            </w:r>
+          </w:p>
+          <w:p>
+            <w:pPr>
+              <w:ind w:left="8"/>
+              <w:rPr>
+                <w:rFonts w:ascii="Times New Roman" w:hAnsi="Times New Roman" w:cs="Times New Roman"/>
+                <w:sz w:val="18"/>
+                <w:szCs w:val="18"/>
+              </w:rPr>
+            </w:pPr>
+            <w:r>
+              <w:rPr>
+                <w:rFonts w:ascii="Times New Roman" w:hAnsi="Times New Roman" w:cs="Times New Roman"/>
+                <w:sz w:val="18"/>
+                <w:szCs w:val="18"/>
+              </w:rPr>
+              <w:t xml:space="preserve"> </w:t>
+            </w:r>
+          </w:p>
+          <w:p>
+            <w:pPr>
+              <w:ind w:left="8"/>
+              <w:rPr>
+                <w:rFonts w:ascii="Times New Roman" w:hAnsi="Times New Roman" w:cs="Times New Roman"/>
+                <w:sz w:val="18"/>
+                <w:szCs w:val="18"/>
+              </w:rPr>
+            </w:pPr>
+          </w:p>
+          <w:p>
+            <w:pPr>
+              <w:ind w:left="8"/>
+              <w:rPr>
+                <w:rFonts w:ascii="Times New Roman" w:hAnsi="Times New Roman" w:cs="Times New Roman"/>
+                <w:sz w:val="18"/>
+                <w:szCs w:val="18"/>
+              </w:rPr>
+            </w:pPr>
+          </w:p>
+          <w:p>
+            <w:pPr>
+              <w:ind w:left="8"/>
+              <w:rPr>
+                <w:rFonts w:ascii="Times New Roman" w:hAnsi="Times New Roman" w:cs="Times New Roman"/>
+                <w:sz w:val="18"/>
+                <w:szCs w:val="18"/>
+              </w:rPr>
+            </w:pPr>
+          </w:p>
+          <w:p>
+            <w:pPr>
+              <w:ind w:left="8"/>
+              <w:rPr>
+                <w:rFonts w:ascii="Times New Roman" w:hAnsi="Times New Roman" w:cs="Times New Roman"/>
+                <w:sz w:val="18"/>
+                <w:szCs w:val="18"/>
+              </w:rPr>
+            </w:pPr>
+          </w:p>
+          <w:p>
+            <w:pPr>
+              <w:ind w:left="8"/>
+              <w:rPr>
+                <w:rFonts w:ascii="Times New Roman" w:hAnsi="Times New Roman" w:cs="Times New Roman"/>
+                <w:sz w:val="18"/>
+                <w:szCs w:val="18"/>
+              </w:rPr>
+            </w:pPr>
+            <w:r>
+              <w:rPr>
+                <w:rFonts w:ascii="Times New Roman" w:hAnsi="Times New Roman" w:cs="Times New Roman"/>
+                <w:sz w:val="18"/>
+                <w:szCs w:val="18"/>
+              </w:rPr>
+              <w:t xml:space="preserve">10M </w:t>
+            </w:r>
+          </w:p>
+          <w:p>
+            <w:pPr>
+              <w:ind w:left="8"/>
+              <w:rPr>
+                <w:rFonts w:ascii="Times New Roman" w:hAnsi="Times New Roman" w:cs="Times New Roman"/>
+                <w:sz w:val="18"/>
+                <w:szCs w:val="18"/>
+              </w:rPr>
+            </w:pPr>
+            <w:r>
+              <w:rPr>
+                <w:rFonts w:ascii="Times New Roman" w:hAnsi="Times New Roman" w:cs="Times New Roman"/>
+                <w:sz w:val="18"/>
+                <w:szCs w:val="18"/>
+              </w:rPr>
+              <w:t xml:space="preserve"> </w:t>
+            </w:r>
+          </w:p>
+        </w:tc>
+      </w:tr>
+    </w:tbl>
+    <w:p>
+      <w:pPr>
+        <w:spacing w:after="216"/>
+        <w:rPr>
+          <w:rFonts w:ascii="Times New Roman" w:hAnsi="Times New Roman" w:cs="Times New Roman"/>
+        </w:rPr>
+      </w:pPr>
+      <w:r>
+        <w:rPr>
+          <w:rFonts w:ascii="Times New Roman" w:hAnsi="Times New Roman" w:cs="Times New Roman"/>
+        </w:rPr>
+        <w:t xml:space="preserve"> </w:t>
+      </w:r>
+    </w:p>
+    <w:p>
+      <w:pPr>
+        <w:spacing w:after="216"/>
+        <w:rPr>
+          <w:rFonts w:ascii="Times New Roman" w:hAnsi="Times New Roman" w:cs="Times New Roman"/>
+        </w:rPr>
+      </w:pPr>
+    </w:p>
+    <w:p>
+      <w:pPr>
+        <w:rPr>
+          <w:rFonts w:ascii="Times New Roman" w:eastAsia="Times New Roman" w:hAnsi="Times New Roman" w:cs="Times New Roman"/>
+          <w:sz w:val="24"/>
+          <w:szCs w:val="24"/>
+          <w:highlight w:val="yellow"/>
+        </w:rPr>
+      </w:pPr>
+      <w:r>
+        <w:rPr>
+          <w:rFonts w:ascii="Times New Roman" w:eastAsia="Times New Roman" w:hAnsi="Times New Roman" w:cs="Times New Roman"/>
+          <w:b/>
+          <w:sz w:val="24"/>
+          <w:szCs w:val="24"/>
+        </w:rPr>
+        <w:t>Faculty In-charge                                                                                                     HOD</w:t>
+      </w:r>
     </w:p>
     <w:sectPr>
       <w:pgSz w:w="12240" w:h="15840"/>
@@ -3358,6 +6598,155 @@
     </w:lvl>
   </w:abstractNum>
   <w:abstractNum w:abstractNumId="5" w15:restartNumberingAfterBreak="0">
+    <w:nsid w:val="34A548E8"/>
+    <w:multiLevelType w:val="multilevel"/>
+    <w:tmpl w:val="60FCFAB6"/>
+    <w:lvl w:ilvl="0">
+      <w:start w:val="1"/>
+      <w:numFmt w:val="bullet"/>
+      <w:lvlText w:val=""/>
+      <w:lvlJc w:val="left"/>
+      <w:pPr>
+        <w:tabs>
+          <w:tab w:val="num" w:pos="720"/>
+        </w:tabs>
+        <w:ind w:left="720" w:hanging="360"/>
+      </w:pPr>
+      <w:rPr>
+        <w:rFonts w:ascii="Symbol" w:hAnsi="Symbol" w:hint="default"/>
+        <w:sz w:val="20"/>
+      </w:rPr>
+    </w:lvl>
+    <w:lvl w:ilvl="1" w:tentative="1">
+      <w:start w:val="1"/>
+      <w:numFmt w:val="bullet"/>
+      <w:lvlText w:val="o"/>
+      <w:lvlJc w:val="left"/>
+      <w:pPr>
+        <w:tabs>
+          <w:tab w:val="num" w:pos="1440"/>
+        </w:tabs>
+        <w:ind w:left="1440" w:hanging="360"/>
+      </w:pPr>
+      <w:rPr>
+        <w:rFonts w:ascii="Courier New" w:hAnsi="Courier New" w:hint="default"/>
+        <w:sz w:val="20"/>
+      </w:rPr>
+    </w:lvl>
+    <w:lvl w:ilvl="2" w:tentative="1">
+      <w:start w:val="1"/>
+      <w:numFmt w:val="bullet"/>
+      <w:lvlText w:val=""/>
+      <w:lvlJc w:val="left"/>
+      <w:pPr>
+        <w:tabs>
+          <w:tab w:val="num" w:pos="2160"/>
+        </w:tabs>
+        <w:ind w:left="2160" w:hanging="360"/>
+      </w:pPr>
+      <w:rPr>
+        <w:rFonts w:ascii="Wingdings" w:hAnsi="Wingdings" w:hint="default"/>
+        <w:sz w:val="20"/>
+      </w:rPr>
+    </w:lvl>
+    <w:lvl w:ilvl="3" w:tentative="1">
+      <w:start w:val="1"/>
+      <w:numFmt w:val="bullet"/>
+      <w:lvlText w:val=""/>
+      <w:lvlJc w:val="left"/>
+      <w:pPr>
+        <w:tabs>
+          <w:tab w:val="num" w:pos="2880"/>
+        </w:tabs>
+        <w:ind w:left="2880" w:hanging="360"/>
+      </w:pPr>
+      <w:rPr>
+        <w:rFonts w:ascii="Wingdings" w:hAnsi="Wingdings" w:hint="default"/>
+        <w:sz w:val="20"/>
+      </w:rPr>
+    </w:lvl>
+    <w:lvl w:ilvl="4" w:tentative="1">
+      <w:start w:val="1"/>
+      <w:numFmt w:val="bullet"/>
+      <w:lvlText w:val=""/>
+      <w:lvlJc w:val="left"/>
+      <w:pPr>
+        <w:tabs>
+          <w:tab w:val="num" w:pos="3600"/>
+        </w:tabs>
+        <w:ind w:left="3600" w:hanging="360"/>
+      </w:pPr>
+      <w:rPr>
+        <w:rFonts w:ascii="Wingdings" w:hAnsi="Wingdings" w:hint="default"/>
+        <w:sz w:val="20"/>
+      </w:rPr>
+    </w:lvl>
+    <w:lvl w:ilvl="5" w:tentative="1">
+      <w:start w:val="1"/>
+      <w:numFmt w:val="bullet"/>
+      <w:lvlText w:val=""/>
+      <w:lvlJc w:val="left"/>
+      <w:pPr>
+        <w:tabs>
+          <w:tab w:val="num" w:pos="4320"/>
+        </w:tabs>
+        <w:ind w:left="4320" w:hanging="360"/>
+      </w:pPr>
+      <w:rPr>
+        <w:rFonts w:ascii="Wingdings" w:hAnsi="Wingdings" w:hint="default"/>
+        <w:sz w:val="20"/>
+      </w:rPr>
+    </w:lvl>
+    <w:lvl w:ilvl="6" w:tentative="1">
+      <w:start w:val="1"/>
+      <w:numFmt w:val="bullet"/>
+      <w:lvlText w:val=""/>
+      <w:lvlJc w:val="left"/>
+      <w:pPr>
+        <w:tabs>
+          <w:tab w:val="num" w:pos="5040"/>
+        </w:tabs>
+        <w:ind w:left="5040" w:hanging="360"/>
+      </w:pPr>
+      <w:rPr>
+        <w:rFonts w:ascii="Wingdings" w:hAnsi="Wingdings" w:hint="default"/>
+        <w:sz w:val="20"/>
+      </w:rPr>
+    </w:lvl>
+    <w:lvl w:ilvl="7" w:tentative="1">
+      <w:start w:val="1"/>
+      <w:numFmt w:val="bullet"/>
+      <w:lvlText w:val=""/>
+      <w:lvlJc w:val="left"/>
+      <w:pPr>
+        <w:tabs>
+          <w:tab w:val="num" w:pos="5760"/>
+        </w:tabs>
+        <w:ind w:left="5760" w:hanging="360"/>
+      </w:pPr>
+      <w:rPr>
+        <w:rFonts w:ascii="Wingdings" w:hAnsi="Wingdings" w:hint="default"/>
+        <w:sz w:val="20"/>
+      </w:rPr>
+    </w:lvl>
+    <w:lvl w:ilvl="8" w:tentative="1">
+      <w:start w:val="1"/>
+      <w:numFmt w:val="bullet"/>
+      <w:lvlText w:val=""/>
+      <w:lvlJc w:val="left"/>
+      <w:pPr>
+        <w:tabs>
+          <w:tab w:val="num" w:pos="6480"/>
+        </w:tabs>
+        <w:ind w:left="6480" w:hanging="360"/>
+      </w:pPr>
+      <w:rPr>
+        <w:rFonts w:ascii="Wingdings" w:hAnsi="Wingdings" w:hint="default"/>
+        <w:sz w:val="20"/>
+      </w:rPr>
+    </w:lvl>
+  </w:abstractNum>
+  <w:abstractNum w:abstractNumId="6" w15:restartNumberingAfterBreak="0">
     <w:nsid w:val="34E8643F"/>
     <w:multiLevelType w:val="hybridMultilevel"/>
     <w:tmpl w:val="D3D2A0A4"/>
@@ -3469,7 +6858,7 @@
       </w:rPr>
     </w:lvl>
   </w:abstractNum>
-  <w:abstractNum w:abstractNumId="6" w15:restartNumberingAfterBreak="0">
+  <w:abstractNum w:abstractNumId="7" w15:restartNumberingAfterBreak="0">
     <w:nsid w:val="35F23C12"/>
     <w:multiLevelType w:val="multilevel"/>
     <w:tmpl w:val="993E64AE"/>
@@ -3582,7 +6971,7 @@
       </w:rPr>
     </w:lvl>
   </w:abstractNum>
-  <w:abstractNum w:abstractNumId="7" w15:restartNumberingAfterBreak="0">
+  <w:abstractNum w:abstractNumId="8" w15:restartNumberingAfterBreak="0">
     <w:nsid w:val="45384760"/>
     <w:multiLevelType w:val="hybridMultilevel"/>
     <w:tmpl w:val="A768BC52"/>
@@ -3671,7 +7060,7 @@
       </w:pPr>
     </w:lvl>
   </w:abstractNum>
-  <w:abstractNum w:abstractNumId="8" w15:restartNumberingAfterBreak="0">
+  <w:abstractNum w:abstractNumId="9" w15:restartNumberingAfterBreak="0">
     <w:nsid w:val="496456A1"/>
     <w:multiLevelType w:val="hybridMultilevel"/>
     <w:tmpl w:val="91CEFE08"/>
@@ -3783,7 +7172,7 @@
       </w:rPr>
     </w:lvl>
   </w:abstractNum>
-  <w:abstractNum w:abstractNumId="9" w15:restartNumberingAfterBreak="0">
+  <w:abstractNum w:abstractNumId="10" w15:restartNumberingAfterBreak="0">
     <w:nsid w:val="49824A6C"/>
     <w:multiLevelType w:val="hybridMultilevel"/>
     <w:tmpl w:val="3670EE24"/>
@@ -3895,7 +7284,7 @@
       </w:rPr>
     </w:lvl>
   </w:abstractNum>
-  <w:abstractNum w:abstractNumId="10" w15:restartNumberingAfterBreak="0">
+  <w:abstractNum w:abstractNumId="11" w15:restartNumberingAfterBreak="0">
     <w:nsid w:val="51380CF4"/>
     <w:multiLevelType w:val="hybridMultilevel"/>
     <w:tmpl w:val="6366A04E"/>
@@ -4007,7 +7396,7 @@
       </w:rPr>
     </w:lvl>
   </w:abstractNum>
-  <w:abstractNum w:abstractNumId="11" w15:restartNumberingAfterBreak="0">
+  <w:abstractNum w:abstractNumId="12" w15:restartNumberingAfterBreak="0">
     <w:nsid w:val="55B125D5"/>
     <w:multiLevelType w:val="hybridMultilevel"/>
     <w:tmpl w:val="20EE955A"/>
@@ -4120,7 +7509,7 @@
       </w:rPr>
     </w:lvl>
   </w:abstractNum>
-  <w:abstractNum w:abstractNumId="12" w15:restartNumberingAfterBreak="0">
+  <w:abstractNum w:abstractNumId="13" w15:restartNumberingAfterBreak="0">
     <w:nsid w:val="5A50072B"/>
     <w:multiLevelType w:val="hybridMultilevel"/>
     <w:tmpl w:val="01E4BEC6"/>
@@ -4232,7 +7621,7 @@
       </w:rPr>
     </w:lvl>
   </w:abstractNum>
-  <w:abstractNum w:abstractNumId="13" w15:restartNumberingAfterBreak="0">
+  <w:abstractNum w:abstractNumId="14" w15:restartNumberingAfterBreak="0">
     <w:nsid w:val="5DD92B06"/>
     <w:multiLevelType w:val="hybridMultilevel"/>
     <w:tmpl w:val="5FEEA4F0"/>
@@ -4344,7 +7733,7 @@
       </w:rPr>
     </w:lvl>
   </w:abstractNum>
-  <w:abstractNum w:abstractNumId="14" w15:restartNumberingAfterBreak="0">
+  <w:abstractNum w:abstractNumId="15" w15:restartNumberingAfterBreak="0">
     <w:nsid w:val="5F28437A"/>
     <w:multiLevelType w:val="hybridMultilevel"/>
     <w:tmpl w:val="A8D68F8E"/>
@@ -4456,7 +7845,7 @@
       </w:rPr>
     </w:lvl>
   </w:abstractNum>
-  <w:abstractNum w:abstractNumId="15" w15:restartNumberingAfterBreak="0">
+  <w:abstractNum w:abstractNumId="16" w15:restartNumberingAfterBreak="0">
     <w:nsid w:val="62826376"/>
     <w:multiLevelType w:val="hybridMultilevel"/>
     <w:tmpl w:val="D04C93AA"/>
@@ -4569,7 +7958,7 @@
       </w:rPr>
     </w:lvl>
   </w:abstractNum>
-  <w:abstractNum w:abstractNumId="16" w15:restartNumberingAfterBreak="0">
+  <w:abstractNum w:abstractNumId="17" w15:restartNumberingAfterBreak="0">
     <w:nsid w:val="66A33E57"/>
     <w:multiLevelType w:val="hybridMultilevel"/>
     <w:tmpl w:val="F8662B42"/>
@@ -4658,7 +8047,7 @@
       </w:pPr>
     </w:lvl>
   </w:abstractNum>
-  <w:abstractNum w:abstractNumId="17" w15:restartNumberingAfterBreak="0">
+  <w:abstractNum w:abstractNumId="18" w15:restartNumberingAfterBreak="0">
     <w:nsid w:val="692E49FE"/>
     <w:multiLevelType w:val="hybridMultilevel"/>
     <w:tmpl w:val="9260DDFC"/>
@@ -4747,7 +8136,7 @@
       </w:pPr>
     </w:lvl>
   </w:abstractNum>
-  <w:abstractNum w:abstractNumId="18" w15:restartNumberingAfterBreak="0">
+  <w:abstractNum w:abstractNumId="19" w15:restartNumberingAfterBreak="0">
     <w:nsid w:val="69727880"/>
     <w:multiLevelType w:val="hybridMultilevel"/>
     <w:tmpl w:val="F476D294"/>
@@ -4859,7 +8248,7 @@
       </w:rPr>
     </w:lvl>
   </w:abstractNum>
-  <w:abstractNum w:abstractNumId="19" w15:restartNumberingAfterBreak="0">
+  <w:abstractNum w:abstractNumId="20" w15:restartNumberingAfterBreak="0">
     <w:nsid w:val="69F1203B"/>
     <w:multiLevelType w:val="hybridMultilevel"/>
     <w:tmpl w:val="1DBE6A5C"/>
@@ -4971,7 +8360,7 @@
       </w:rPr>
     </w:lvl>
   </w:abstractNum>
-  <w:abstractNum w:abstractNumId="20" w15:restartNumberingAfterBreak="0">
+  <w:abstractNum w:abstractNumId="21" w15:restartNumberingAfterBreak="0">
     <w:nsid w:val="6CE436DD"/>
     <w:multiLevelType w:val="hybridMultilevel"/>
     <w:tmpl w:val="4020908E"/>
@@ -5083,7 +8472,7 @@
       </w:rPr>
     </w:lvl>
   </w:abstractNum>
-  <w:abstractNum w:abstractNumId="21" w15:restartNumberingAfterBreak="0">
+  <w:abstractNum w:abstractNumId="22" w15:restartNumberingAfterBreak="0">
     <w:nsid w:val="7312503C"/>
     <w:multiLevelType w:val="hybridMultilevel"/>
     <w:tmpl w:val="C3D66796"/>
@@ -5195,7 +8584,7 @@
       </w:rPr>
     </w:lvl>
   </w:abstractNum>
-  <w:abstractNum w:abstractNumId="22" w15:restartNumberingAfterBreak="0">
+  <w:abstractNum w:abstractNumId="23" w15:restartNumberingAfterBreak="0">
     <w:nsid w:val="7782036E"/>
     <w:multiLevelType w:val="hybridMultilevel"/>
     <w:tmpl w:val="C2CA53B4"/>
@@ -5307,7 +8696,7 @@
       </w:rPr>
     </w:lvl>
   </w:abstractNum>
-  <w:abstractNum w:abstractNumId="23" w15:restartNumberingAfterBreak="0">
+  <w:abstractNum w:abstractNumId="24" w15:restartNumberingAfterBreak="0">
     <w:nsid w:val="78DF5851"/>
     <w:multiLevelType w:val="hybridMultilevel"/>
     <w:tmpl w:val="E8F8EF86"/>
@@ -5419,7 +8808,7 @@
       </w:rPr>
     </w:lvl>
   </w:abstractNum>
-  <w:abstractNum w:abstractNumId="24" w15:restartNumberingAfterBreak="0">
+  <w:abstractNum w:abstractNumId="25" w15:restartNumberingAfterBreak="0">
     <w:nsid w:val="7D1732D8"/>
     <w:multiLevelType w:val="hybridMultilevel"/>
     <w:tmpl w:val="A39AC87E"/>
@@ -5531,7 +8920,7 @@
       </w:rPr>
     </w:lvl>
   </w:abstractNum>
-  <w:abstractNum w:abstractNumId="25" w15:restartNumberingAfterBreak="0">
+  <w:abstractNum w:abstractNumId="26" w15:restartNumberingAfterBreak="0">
     <w:nsid w:val="7E166C0E"/>
     <w:multiLevelType w:val="hybridMultilevel"/>
     <w:tmpl w:val="F8662B42"/>
@@ -5621,34 +9010,34 @@
     </w:lvl>
   </w:abstractNum>
   <w:num w:numId="1" w16cid:durableId="639386242">
-    <w:abstractNumId w:val="6"/>
+    <w:abstractNumId w:val="7"/>
   </w:num>
   <w:num w:numId="2" w16cid:durableId="1810439372">
     <w:abstractNumId w:val="0"/>
   </w:num>
   <w:num w:numId="3" w16cid:durableId="1440251567">
-    <w:abstractNumId w:val="7"/>
+    <w:abstractNumId w:val="8"/>
   </w:num>
   <w:num w:numId="4" w16cid:durableId="1507475475">
-    <w:abstractNumId w:val="15"/>
+    <w:abstractNumId w:val="16"/>
   </w:num>
   <w:num w:numId="5" w16cid:durableId="471286763">
-    <w:abstractNumId w:val="10"/>
+    <w:abstractNumId w:val="11"/>
   </w:num>
   <w:num w:numId="6" w16cid:durableId="1850481944">
     <w:abstractNumId w:val="3"/>
   </w:num>
   <w:num w:numId="7" w16cid:durableId="740521307">
-    <w:abstractNumId w:val="25"/>
+    <w:abstractNumId w:val="26"/>
   </w:num>
   <w:num w:numId="8" w16cid:durableId="1041857787">
-    <w:abstractNumId w:val="16"/>
+    <w:abstractNumId w:val="17"/>
   </w:num>
   <w:num w:numId="9" w16cid:durableId="493842621">
-    <w:abstractNumId w:val="11"/>
+    <w:abstractNumId w:val="12"/>
   </w:num>
   <w:num w:numId="10" w16cid:durableId="1940798077">
-    <w:abstractNumId w:val="19"/>
+    <w:abstractNumId w:val="20"/>
   </w:num>
   <w:num w:numId="11" w16cid:durableId="1154492565">
     <w:abstractNumId w:val="4"/>
@@ -5657,46 +9046,49 @@
     <w:abstractNumId w:val="2"/>
   </w:num>
   <w:num w:numId="13" w16cid:durableId="681511385">
-    <w:abstractNumId w:val="5"/>
+    <w:abstractNumId w:val="6"/>
   </w:num>
   <w:num w:numId="14" w16cid:durableId="2089644568">
-    <w:abstractNumId w:val="13"/>
+    <w:abstractNumId w:val="14"/>
   </w:num>
   <w:num w:numId="15" w16cid:durableId="465128309">
-    <w:abstractNumId w:val="18"/>
+    <w:abstractNumId w:val="19"/>
   </w:num>
   <w:num w:numId="16" w16cid:durableId="1876892879">
-    <w:abstractNumId w:val="21"/>
+    <w:abstractNumId w:val="22"/>
   </w:num>
   <w:num w:numId="17" w16cid:durableId="1242789744">
-    <w:abstractNumId w:val="22"/>
+    <w:abstractNumId w:val="23"/>
   </w:num>
   <w:num w:numId="18" w16cid:durableId="598029410">
-    <w:abstractNumId w:val="14"/>
+    <w:abstractNumId w:val="15"/>
   </w:num>
   <w:num w:numId="19" w16cid:durableId="2042658262">
-    <w:abstractNumId w:val="9"/>
+    <w:abstractNumId w:val="10"/>
   </w:num>
   <w:num w:numId="20" w16cid:durableId="1115252615">
-    <w:abstractNumId w:val="24"/>
+    <w:abstractNumId w:val="25"/>
   </w:num>
   <w:num w:numId="21" w16cid:durableId="273248054">
-    <w:abstractNumId w:val="8"/>
+    <w:abstractNumId w:val="9"/>
   </w:num>
   <w:num w:numId="22" w16cid:durableId="276062400">
     <w:abstractNumId w:val="1"/>
   </w:num>
   <w:num w:numId="23" w16cid:durableId="1520655569">
-    <w:abstractNumId w:val="12"/>
+    <w:abstractNumId w:val="13"/>
   </w:num>
   <w:num w:numId="24" w16cid:durableId="668944858">
-    <w:abstractNumId w:val="23"/>
+    <w:abstractNumId w:val="24"/>
   </w:num>
   <w:num w:numId="25" w16cid:durableId="295718607">
-    <w:abstractNumId w:val="20"/>
+    <w:abstractNumId w:val="21"/>
   </w:num>
   <w:num w:numId="26" w16cid:durableId="217710753">
-    <w:abstractNumId w:val="17"/>
+    <w:abstractNumId w:val="18"/>
+  </w:num>
+  <w:num w:numId="27" w16cid:durableId="1657688777">
+    <w:abstractNumId w:val="5"/>
   </w:num>
 </w:numbering>
 </file>
@@ -6304,7 +9696,6 @@
   <w:style w:type="character" w:default="1" w:styleId="DefaultParagraphFont">
     <w:name w:val="Default Paragraph Font"/>
     <w:uiPriority w:val="1"/>
-    <w:semiHidden/>
     <w:unhideWhenUsed/>
   </w:style>
   <w:style w:type="table" w:default="1" w:styleId="TableNormal">

</xml_diff>